<commit_message>
Camera and mic work on windows. separate file stemmed
</commit_message>
<xml_diff>
--- a/Homework/HW11/hw11-ch3_p3-41_70_44.docx
+++ b/Homework/HW11/hw11-ch3_p3-41_70_44.docx
@@ -20,7 +20,13 @@
         <w:t>NAME:</w:t>
       </w:r>
       <w:r>
-        <w:t xml:space="preserve"> ____________________________</w:t>
+        <w:t xml:space="preserve"> ___________</w:t>
+      </w:r>
+      <w:r>
+        <w:t>Seth Ricks</w:t>
+      </w:r>
+      <w:r>
+        <w:t>________</w:t>
       </w:r>
       <w:r>
         <w:tab/>
@@ -202,18 +208,8 @@
           <w:sz w:val="20"/>
           <w:szCs w:val="20"/>
         </w:rPr>
-        <w:t>int *</w:t>
-      </w:r>
-      <w:proofErr w:type="gramStart"/>
-      <w:r>
-        <w:rPr>
-          <w:rFonts w:ascii="Courier New" w:hAnsi="Courier New" w:cs="Courier New"/>
-          <w:sz w:val="20"/>
-          <w:szCs w:val="20"/>
-        </w:rPr>
-        <w:t>p;</w:t>
-      </w:r>
-      <w:proofErr w:type="gramEnd"/>
+        <w:t>int *p;</w:t>
+      </w:r>
     </w:p>
     <w:p>
       <w:pPr>
@@ -264,18 +260,8 @@
           <w:szCs w:val="20"/>
         </w:rPr>
         <w:tab/>
-        <w:t xml:space="preserve">int </w:t>
-      </w:r>
-      <w:proofErr w:type="gramStart"/>
-      <w:r>
-        <w:rPr>
-          <w:rFonts w:ascii="Courier New" w:hAnsi="Courier New" w:cs="Courier New"/>
-          <w:sz w:val="20"/>
-          <w:szCs w:val="20"/>
-        </w:rPr>
-        <w:t>x;</w:t>
-      </w:r>
-      <w:proofErr w:type="gramEnd"/>
+        <w:t>int x;</w:t>
+      </w:r>
     </w:p>
     <w:p>
       <w:pPr>
@@ -304,18 +290,8 @@
           <w:szCs w:val="20"/>
         </w:rPr>
         <w:tab/>
-        <w:t xml:space="preserve">int </w:t>
-      </w:r>
-      <w:proofErr w:type="gramStart"/>
-      <w:r>
-        <w:rPr>
-          <w:rFonts w:ascii="Courier New" w:hAnsi="Courier New" w:cs="Courier New"/>
-          <w:sz w:val="20"/>
-          <w:szCs w:val="20"/>
-        </w:rPr>
-        <w:t>y;</w:t>
-      </w:r>
-      <w:proofErr w:type="gramEnd"/>
+        <w:t>int y;</w:t>
+      </w:r>
     </w:p>
     <w:p>
       <w:pPr>
@@ -336,16 +312,7 @@
           <w:szCs w:val="20"/>
         </w:rPr>
         <w:tab/>
-        <w:t xml:space="preserve">} </w:t>
-      </w:r>
-      <w:proofErr w:type="gramStart"/>
-      <w:r>
-        <w:rPr>
-          <w:rFonts w:ascii="Courier New" w:hAnsi="Courier New" w:cs="Courier New"/>
-          <w:sz w:val="20"/>
-          <w:szCs w:val="20"/>
-        </w:rPr>
-        <w:t>s</w:t>
+        <w:t>} s</w:t>
       </w:r>
       <w:r>
         <w:rPr>
@@ -355,7 +322,6 @@
         </w:rPr>
         <w:t>;</w:t>
       </w:r>
-      <w:proofErr w:type="gramEnd"/>
     </w:p>
     <w:p>
       <w:pPr>
@@ -376,18 +342,8 @@
           <w:szCs w:val="20"/>
         </w:rPr>
         <w:tab/>
-        <w:t>struct prob *</w:t>
-      </w:r>
-      <w:proofErr w:type="gramStart"/>
-      <w:r>
-        <w:rPr>
-          <w:rFonts w:ascii="Courier New" w:hAnsi="Courier New" w:cs="Courier New"/>
-          <w:sz w:val="20"/>
-          <w:szCs w:val="20"/>
-        </w:rPr>
-        <w:t>next;</w:t>
-      </w:r>
-      <w:proofErr w:type="gramEnd"/>
+        <w:t>struct prob *next;</w:t>
+      </w:r>
     </w:p>
     <w:p>
       <w:pPr>
@@ -401,7 +357,6 @@
           <w:szCs w:val="20"/>
         </w:rPr>
       </w:pPr>
-      <w:proofErr w:type="gramStart"/>
       <w:r>
         <w:rPr>
           <w:rFonts w:ascii="Courier New" w:hAnsi="Courier New" w:cs="Courier New"/>
@@ -410,7 +365,6 @@
         </w:rPr>
         <w:t>};</w:t>
       </w:r>
-      <w:proofErr w:type="gramEnd"/>
     </w:p>
     <w:p>
       <w:pPr>
@@ -467,89 +421,7 @@
           <w:sz w:val="20"/>
           <w:szCs w:val="20"/>
         </w:rPr>
-        <w:t xml:space="preserve">void </w:t>
-      </w:r>
-      <w:proofErr w:type="spellStart"/>
-      <w:r>
-        <w:rPr>
-          <w:rFonts w:ascii="Courier New" w:hAnsi="Courier New" w:cs="Courier New"/>
-          <w:sz w:val="20"/>
-          <w:szCs w:val="20"/>
-        </w:rPr>
-        <w:t>sp_</w:t>
-      </w:r>
-      <w:proofErr w:type="gramStart"/>
-      <w:r>
-        <w:rPr>
-          <w:rFonts w:ascii="Courier New" w:hAnsi="Courier New" w:cs="Courier New"/>
-          <w:sz w:val="20"/>
-          <w:szCs w:val="20"/>
-        </w:rPr>
-        <w:t>init</w:t>
-      </w:r>
-      <w:proofErr w:type="spellEnd"/>
-      <w:r>
-        <w:rPr>
-          <w:rFonts w:ascii="Courier New" w:hAnsi="Courier New" w:cs="Courier New"/>
-          <w:sz w:val="20"/>
-          <w:szCs w:val="20"/>
-        </w:rPr>
-        <w:t>(</w:t>
-      </w:r>
-      <w:proofErr w:type="gramEnd"/>
-      <w:r>
-        <w:rPr>
-          <w:rFonts w:ascii="Courier New" w:hAnsi="Courier New" w:cs="Courier New"/>
-          <w:sz w:val="20"/>
-          <w:szCs w:val="20"/>
-        </w:rPr>
-        <w:t>struct prob *</w:t>
-      </w:r>
-      <w:proofErr w:type="spellStart"/>
-      <w:proofErr w:type="gramStart"/>
-      <w:r>
-        <w:rPr>
-          <w:rFonts w:ascii="Courier New" w:hAnsi="Courier New" w:cs="Courier New"/>
-          <w:sz w:val="20"/>
-          <w:szCs w:val="20"/>
-        </w:rPr>
-        <w:t>sp</w:t>
-      </w:r>
-      <w:proofErr w:type="spellEnd"/>
-      <w:r>
-        <w:rPr>
-          <w:rFonts w:ascii="Courier New" w:hAnsi="Courier New" w:cs="Courier New"/>
-          <w:sz w:val="20"/>
-          <w:szCs w:val="20"/>
-        </w:rPr>
-        <w:t xml:space="preserve">)   </w:t>
-      </w:r>
-      <w:proofErr w:type="gramEnd"/>
-      <w:r>
-        <w:rPr>
-          <w:rFonts w:ascii="Courier New" w:hAnsi="Courier New" w:cs="Courier New"/>
-          <w:sz w:val="20"/>
-          <w:szCs w:val="20"/>
-        </w:rPr>
-        <w:t xml:space="preserve">        /</w:t>
-      </w:r>
-      <w:proofErr w:type="gramStart"/>
-      <w:r>
-        <w:rPr>
-          <w:rFonts w:ascii="Courier New" w:hAnsi="Courier New" w:cs="Courier New"/>
-          <w:sz w:val="20"/>
-          <w:szCs w:val="20"/>
-        </w:rPr>
-        <w:t>/(</w:t>
-      </w:r>
-      <w:proofErr w:type="gramEnd"/>
-      <w:r>
-        <w:rPr>
-          <w:rFonts w:ascii="Courier New" w:hAnsi="Courier New" w:cs="Courier New"/>
-          <w:sz w:val="20"/>
-          <w:szCs w:val="20"/>
-        </w:rPr>
-        <w:t>3) points</w:t>
+        <w:t>void sp_init(struct prob *sp)           //(3) points</w:t>
       </w:r>
     </w:p>
     <w:p>
@@ -564,23 +436,13 @@
           <w:szCs w:val="20"/>
         </w:rPr>
       </w:pPr>
-      <w:proofErr w:type="gramStart"/>
-      <w:r>
-        <w:rPr>
-          <w:rFonts w:ascii="Courier New" w:hAnsi="Courier New" w:cs="Courier New"/>
-          <w:sz w:val="20"/>
-          <w:szCs w:val="20"/>
-        </w:rPr>
-        <w:t xml:space="preserve">{  </w:t>
-      </w:r>
-      <w:proofErr w:type="gramEnd"/>
-      <w:r>
-        <w:rPr>
-          <w:rFonts w:ascii="Courier New" w:hAnsi="Courier New" w:cs="Courier New"/>
-          <w:sz w:val="20"/>
-          <w:szCs w:val="20"/>
-        </w:rPr>
-        <w:t xml:space="preserve">                                     // Fill in after doing part C.</w:t>
+      <w:r>
+        <w:rPr>
+          <w:rFonts w:ascii="Courier New" w:hAnsi="Courier New" w:cs="Courier New"/>
+          <w:sz w:val="20"/>
+          <w:szCs w:val="20"/>
+        </w:rPr>
+        <w:t>{                                       // Fill in after doing part C.</w:t>
       </w:r>
     </w:p>
     <w:p>
@@ -602,50 +464,15 @@
           <w:szCs w:val="20"/>
         </w:rPr>
         <w:tab/>
-      </w:r>
-      <w:proofErr w:type="spellStart"/>
-      <w:r>
-        <w:rPr>
-          <w:rFonts w:ascii="Courier New" w:hAnsi="Courier New" w:cs="Courier New"/>
-          <w:sz w:val="20"/>
-          <w:szCs w:val="20"/>
-        </w:rPr>
-        <w:t>sp</w:t>
-      </w:r>
-      <w:proofErr w:type="spellEnd"/>
-      <w:r>
-        <w:rPr>
-          <w:rFonts w:ascii="Courier New" w:hAnsi="Courier New" w:cs="Courier New"/>
-          <w:sz w:val="20"/>
-          <w:szCs w:val="20"/>
-        </w:rPr>
-        <w:t>-&gt;</w:t>
-      </w:r>
-      <w:proofErr w:type="spellStart"/>
-      <w:r>
-        <w:rPr>
-          <w:rFonts w:ascii="Courier New" w:hAnsi="Courier New" w:cs="Courier New"/>
-          <w:sz w:val="20"/>
-          <w:szCs w:val="20"/>
-        </w:rPr>
-        <w:t>s.x</w:t>
-      </w:r>
-      <w:proofErr w:type="spellEnd"/>
-      <w:r>
-        <w:rPr>
-          <w:rFonts w:ascii="Courier New" w:hAnsi="Courier New" w:cs="Courier New"/>
-          <w:sz w:val="20"/>
-          <w:szCs w:val="20"/>
-        </w:rPr>
-        <w:tab/>
-      </w:r>
-      <w:proofErr w:type="gramStart"/>
-      <w:r>
-        <w:rPr>
-          <w:rFonts w:ascii="Courier New" w:hAnsi="Courier New" w:cs="Courier New"/>
-          <w:sz w:val="20"/>
-          <w:szCs w:val="20"/>
-        </w:rPr>
+        <w:t>sp-&gt;s.x</w:t>
+      </w:r>
+      <w:r>
+        <w:rPr>
+          <w:rFonts w:ascii="Courier New" w:hAnsi="Courier New" w:cs="Courier New"/>
+          <w:sz w:val="20"/>
+          <w:szCs w:val="20"/>
+        </w:rPr>
+        <w:tab/>
         <w:t xml:space="preserve">= </w:t>
       </w:r>
       <w:r>
@@ -653,18 +480,9 @@
           <w:rFonts w:ascii="Courier New" w:hAnsi="Courier New" w:cs="Courier New"/>
           <w:sz w:val="20"/>
           <w:szCs w:val="20"/>
-          <w:u w:val="single"/>
-        </w:rPr>
-        <w:tab/>
-      </w:r>
-      <w:r>
-        <w:rPr>
-          <w:rFonts w:ascii="Courier New" w:hAnsi="Courier New" w:cs="Courier New"/>
-          <w:sz w:val="20"/>
-          <w:szCs w:val="20"/>
-          <w:u w:val="single"/>
-        </w:rPr>
-        <w:tab/>
+          <w:highlight w:val="yellow"/>
+        </w:rPr>
+        <w:t>sp-&gt;s.y</w:t>
       </w:r>
       <w:r>
         <w:rPr>
@@ -674,7 +492,6 @@
         </w:rPr>
         <w:t>;</w:t>
       </w:r>
-      <w:proofErr w:type="gramEnd"/>
     </w:p>
     <w:p>
       <w:pPr>
@@ -716,40 +533,15 @@
           <w:szCs w:val="20"/>
         </w:rPr>
         <w:tab/>
-      </w:r>
-      <w:proofErr w:type="spellStart"/>
-      <w:r>
-        <w:rPr>
-          <w:rFonts w:ascii="Courier New" w:hAnsi="Courier New" w:cs="Courier New"/>
-          <w:sz w:val="20"/>
-          <w:szCs w:val="20"/>
-        </w:rPr>
-        <w:t>sp</w:t>
-      </w:r>
-      <w:proofErr w:type="spellEnd"/>
-      <w:r>
-        <w:rPr>
-          <w:rFonts w:ascii="Courier New" w:hAnsi="Courier New" w:cs="Courier New"/>
-          <w:sz w:val="20"/>
-          <w:szCs w:val="20"/>
-        </w:rPr>
-        <w:t>-&gt;p</w:t>
-      </w:r>
-      <w:r>
-        <w:rPr>
-          <w:rFonts w:ascii="Courier New" w:hAnsi="Courier New" w:cs="Courier New"/>
-          <w:sz w:val="20"/>
-          <w:szCs w:val="20"/>
-        </w:rPr>
-        <w:tab/>
-      </w:r>
-      <w:proofErr w:type="gramStart"/>
-      <w:r>
-        <w:rPr>
-          <w:rFonts w:ascii="Courier New" w:hAnsi="Courier New" w:cs="Courier New"/>
-          <w:sz w:val="20"/>
-          <w:szCs w:val="20"/>
-        </w:rPr>
+        <w:t>sp-&gt;p</w:t>
+      </w:r>
+      <w:r>
+        <w:rPr>
+          <w:rFonts w:ascii="Courier New" w:hAnsi="Courier New" w:cs="Courier New"/>
+          <w:sz w:val="20"/>
+          <w:szCs w:val="20"/>
+        </w:rPr>
+        <w:tab/>
         <w:t xml:space="preserve">= </w:t>
       </w:r>
       <w:r>
@@ -757,18 +549,35 @@
           <w:rFonts w:ascii="Courier New" w:hAnsi="Courier New" w:cs="Courier New"/>
           <w:sz w:val="20"/>
           <w:szCs w:val="20"/>
-          <w:u w:val="single"/>
-        </w:rPr>
-        <w:tab/>
-      </w:r>
-      <w:r>
-        <w:rPr>
-          <w:rFonts w:ascii="Courier New" w:hAnsi="Courier New" w:cs="Courier New"/>
-          <w:sz w:val="20"/>
-          <w:szCs w:val="20"/>
-          <w:u w:val="single"/>
-        </w:rPr>
-        <w:tab/>
+          <w:highlight w:val="yellow"/>
+        </w:rPr>
+        <w:t>&amp;</w:t>
+      </w:r>
+      <w:r>
+        <w:rPr>
+          <w:rFonts w:ascii="Courier New" w:hAnsi="Courier New" w:cs="Courier New"/>
+          <w:sz w:val="20"/>
+          <w:szCs w:val="20"/>
+          <w:highlight w:val="yellow"/>
+        </w:rPr>
+        <w:t>(sp-&gt;</w:t>
+      </w:r>
+      <w:r>
+        <w:rPr>
+          <w:rFonts w:ascii="Courier New" w:hAnsi="Courier New" w:cs="Courier New"/>
+          <w:sz w:val="20"/>
+          <w:szCs w:val="20"/>
+          <w:highlight w:val="yellow"/>
+        </w:rPr>
+        <w:t>s.x</w:t>
+      </w:r>
+      <w:r>
+        <w:rPr>
+          <w:rFonts w:ascii="Courier New" w:hAnsi="Courier New" w:cs="Courier New"/>
+          <w:sz w:val="20"/>
+          <w:szCs w:val="20"/>
+        </w:rPr>
+        <w:t>)</w:t>
       </w:r>
       <w:r>
         <w:rPr>
@@ -778,7 +587,6 @@
         </w:rPr>
         <w:t>;</w:t>
       </w:r>
-      <w:proofErr w:type="gramEnd"/>
     </w:p>
     <w:p>
       <w:pPr>
@@ -820,60 +628,26 @@
           <w:szCs w:val="20"/>
         </w:rPr>
         <w:tab/>
-      </w:r>
-      <w:proofErr w:type="spellStart"/>
-      <w:r>
-        <w:rPr>
-          <w:rFonts w:ascii="Courier New" w:hAnsi="Courier New" w:cs="Courier New"/>
-          <w:sz w:val="20"/>
-          <w:szCs w:val="20"/>
+        <w:t>sp-&gt;next</w:t>
+      </w:r>
+      <w:r>
+        <w:rPr>
+          <w:rFonts w:ascii="Courier New" w:hAnsi="Courier New" w:cs="Courier New"/>
+          <w:sz w:val="20"/>
+          <w:szCs w:val="20"/>
+        </w:rPr>
+        <w:tab/>
+        <w:t xml:space="preserve">= </w:t>
+      </w:r>
+      <w:r>
+        <w:rPr>
+          <w:rFonts w:ascii="Courier New" w:hAnsi="Courier New" w:cs="Courier New"/>
+          <w:sz w:val="20"/>
+          <w:szCs w:val="20"/>
+          <w:highlight w:val="yellow"/>
         </w:rPr>
         <w:t>sp</w:t>
       </w:r>
-      <w:proofErr w:type="spellEnd"/>
-      <w:r>
-        <w:rPr>
-          <w:rFonts w:ascii="Courier New" w:hAnsi="Courier New" w:cs="Courier New"/>
-          <w:sz w:val="20"/>
-          <w:szCs w:val="20"/>
-        </w:rPr>
-        <w:t>-&gt;next</w:t>
-      </w:r>
-      <w:r>
-        <w:rPr>
-          <w:rFonts w:ascii="Courier New" w:hAnsi="Courier New" w:cs="Courier New"/>
-          <w:sz w:val="20"/>
-          <w:szCs w:val="20"/>
-        </w:rPr>
-        <w:tab/>
-      </w:r>
-      <w:proofErr w:type="gramStart"/>
-      <w:r>
-        <w:rPr>
-          <w:rFonts w:ascii="Courier New" w:hAnsi="Courier New" w:cs="Courier New"/>
-          <w:sz w:val="20"/>
-          <w:szCs w:val="20"/>
-        </w:rPr>
-        <w:t xml:space="preserve">= </w:t>
-      </w:r>
-      <w:r>
-        <w:rPr>
-          <w:rFonts w:ascii="Courier New" w:hAnsi="Courier New" w:cs="Courier New"/>
-          <w:sz w:val="20"/>
-          <w:szCs w:val="20"/>
-          <w:u w:val="single"/>
-        </w:rPr>
-        <w:tab/>
-      </w:r>
-      <w:r>
-        <w:rPr>
-          <w:rFonts w:ascii="Courier New" w:hAnsi="Courier New" w:cs="Courier New"/>
-          <w:sz w:val="20"/>
-          <w:szCs w:val="20"/>
-          <w:u w:val="single"/>
-        </w:rPr>
-        <w:tab/>
-      </w:r>
       <w:r>
         <w:rPr>
           <w:rFonts w:ascii="Courier New" w:hAnsi="Courier New" w:cs="Courier New"/>
@@ -882,7 +656,6 @@
         </w:rPr>
         <w:t>;</w:t>
       </w:r>
-      <w:proofErr w:type="gramEnd"/>
     </w:p>
     <w:p>
       <w:pPr>
@@ -948,196 +721,158 @@
         <w:tabs>
           <w:tab w:val="left" w:pos="360"/>
         </w:tabs>
-        <w:ind w:left="1125"/>
-      </w:pPr>
-      <w:r>
-        <w:tab/>
-        <w:t xml:space="preserve">   </w:t>
-      </w:r>
-    </w:p>
-    <w:tbl>
-      <w:tblPr>
-        <w:tblW w:w="0" w:type="auto"/>
-        <w:tblInd w:w="1440" w:type="dxa"/>
-        <w:tblBorders>
-          <w:insideV w:val="single" w:sz="4" w:space="0" w:color="auto"/>
-        </w:tblBorders>
-        <w:tblLook w:val="04A0" w:firstRow="1" w:lastRow="0" w:firstColumn="1" w:lastColumn="0" w:noHBand="0" w:noVBand="1"/>
-      </w:tblPr>
-      <w:tblGrid>
-        <w:gridCol w:w="1458"/>
-      </w:tblGrid>
-      <w:tr>
-        <w:trPr>
-          <w:trHeight w:val="275"/>
-        </w:trPr>
-        <w:tc>
-          <w:tcPr>
-            <w:tcW w:w="1458" w:type="dxa"/>
-            <w:vAlign w:val="center"/>
-          </w:tcPr>
-          <w:p>
-            <w:pPr>
-              <w:tabs>
-                <w:tab w:val="left" w:pos="360"/>
-              </w:tabs>
-              <w:jc w:val="right"/>
-              <w:rPr>
-                <w:rFonts w:ascii="Courier New" w:hAnsi="Courier New" w:cs="Courier New"/>
-                <w:sz w:val="20"/>
-                <w:szCs w:val="20"/>
-              </w:rPr>
-            </w:pPr>
-            <w:r>
-              <w:t xml:space="preserve"> </w:t>
-            </w:r>
-            <w:r>
-              <w:rPr>
-                <w:rFonts w:ascii="Courier New" w:hAnsi="Courier New" w:cs="Courier New"/>
-                <w:sz w:val="20"/>
-                <w:szCs w:val="20"/>
-              </w:rPr>
-              <w:t>p:</w:t>
-            </w:r>
-          </w:p>
-        </w:tc>
-      </w:tr>
-      <w:tr>
-        <w:trPr>
-          <w:trHeight w:val="275"/>
-        </w:trPr>
-        <w:tc>
-          <w:tcPr>
-            <w:tcW w:w="1458" w:type="dxa"/>
-            <w:vAlign w:val="center"/>
-          </w:tcPr>
-          <w:p>
-            <w:pPr>
-              <w:tabs>
-                <w:tab w:val="left" w:pos="360"/>
-              </w:tabs>
-              <w:jc w:val="right"/>
-              <w:rPr>
-                <w:rFonts w:ascii="Courier New" w:hAnsi="Courier New" w:cs="Courier New"/>
-                <w:sz w:val="20"/>
-                <w:szCs w:val="20"/>
-              </w:rPr>
-            </w:pPr>
-            <w:r>
-              <w:rPr>
-                <w:rFonts w:ascii="Courier New" w:hAnsi="Courier New" w:cs="Courier New"/>
-                <w:sz w:val="20"/>
-                <w:szCs w:val="20"/>
-              </w:rPr>
-              <w:t xml:space="preserve">  </w:t>
-            </w:r>
-            <w:proofErr w:type="spellStart"/>
-            <w:r>
-              <w:rPr>
-                <w:rFonts w:ascii="Courier New" w:hAnsi="Courier New" w:cs="Courier New"/>
-                <w:sz w:val="20"/>
-                <w:szCs w:val="20"/>
-              </w:rPr>
-              <w:t>s.x</w:t>
-            </w:r>
-            <w:proofErr w:type="spellEnd"/>
-            <w:r>
-              <w:rPr>
-                <w:rFonts w:ascii="Courier New" w:hAnsi="Courier New" w:cs="Courier New"/>
-                <w:sz w:val="20"/>
-                <w:szCs w:val="20"/>
-              </w:rPr>
-              <w:t>:</w:t>
-            </w:r>
-          </w:p>
-        </w:tc>
-      </w:tr>
-      <w:tr>
-        <w:trPr>
-          <w:trHeight w:val="257"/>
-        </w:trPr>
-        <w:tc>
-          <w:tcPr>
-            <w:tcW w:w="1458" w:type="dxa"/>
-            <w:vAlign w:val="center"/>
-          </w:tcPr>
-          <w:p>
-            <w:pPr>
-              <w:tabs>
-                <w:tab w:val="left" w:pos="360"/>
-              </w:tabs>
-              <w:jc w:val="right"/>
-              <w:rPr>
-                <w:rFonts w:ascii="Courier New" w:hAnsi="Courier New" w:cs="Courier New"/>
-                <w:sz w:val="20"/>
-                <w:szCs w:val="20"/>
-              </w:rPr>
-            </w:pPr>
-            <w:r>
-              <w:rPr>
-                <w:rFonts w:ascii="Courier New" w:hAnsi="Courier New" w:cs="Courier New"/>
-                <w:sz w:val="20"/>
-                <w:szCs w:val="20"/>
-              </w:rPr>
-              <w:t xml:space="preserve">   </w:t>
-            </w:r>
-            <w:proofErr w:type="spellStart"/>
-            <w:r>
-              <w:rPr>
-                <w:rFonts w:ascii="Courier New" w:hAnsi="Courier New" w:cs="Courier New"/>
-                <w:sz w:val="20"/>
-                <w:szCs w:val="20"/>
-              </w:rPr>
-              <w:t>s.y</w:t>
-            </w:r>
-            <w:proofErr w:type="spellEnd"/>
-            <w:r>
-              <w:rPr>
-                <w:rFonts w:ascii="Courier New" w:hAnsi="Courier New" w:cs="Courier New"/>
-                <w:sz w:val="20"/>
-                <w:szCs w:val="20"/>
-              </w:rPr>
-              <w:t>:</w:t>
-            </w:r>
-          </w:p>
-        </w:tc>
-      </w:tr>
-      <w:tr>
-        <w:trPr>
-          <w:trHeight w:val="275"/>
-        </w:trPr>
-        <w:tc>
-          <w:tcPr>
-            <w:tcW w:w="1458" w:type="dxa"/>
-            <w:vAlign w:val="center"/>
-          </w:tcPr>
-          <w:p>
-            <w:pPr>
-              <w:tabs>
-                <w:tab w:val="left" w:pos="360"/>
-              </w:tabs>
-              <w:jc w:val="right"/>
-              <w:rPr>
-                <w:rFonts w:ascii="Courier New" w:hAnsi="Courier New" w:cs="Courier New"/>
-                <w:sz w:val="20"/>
-                <w:szCs w:val="20"/>
-              </w:rPr>
-            </w:pPr>
-            <w:r>
-              <w:rPr>
-                <w:rFonts w:ascii="Courier New" w:hAnsi="Courier New" w:cs="Courier New"/>
-                <w:sz w:val="20"/>
-                <w:szCs w:val="20"/>
-              </w:rPr>
-              <w:t xml:space="preserve"> next:</w:t>
-            </w:r>
-          </w:p>
-        </w:tc>
-      </w:tr>
-    </w:tbl>
-    <w:p>
-      <w:pPr>
-        <w:ind w:left="720"/>
+      </w:pPr>
+      <w:r>
+        <w:tab/>
+      </w:r>
+      <w:r>
+        <w:tab/>
+      </w:r>
+      <w:r>
+        <w:tab/>
+      </w:r>
+      <w:r>
+        <w:tab/>
+        <w:t>p: (size 8)</w:t>
+      </w:r>
+      <w:r>
+        <w:t xml:space="preserve"> -&gt; </w:t>
+      </w:r>
+      <w:r>
+        <w:rPr>
+          <w:highlight w:val="yellow"/>
+        </w:rPr>
+        <w:t>offset 0</w:t>
+      </w:r>
+    </w:p>
+    <w:p>
+      <w:pPr>
+        <w:tabs>
+          <w:tab w:val="left" w:pos="360"/>
+        </w:tabs>
+      </w:pPr>
+      <w:r>
+        <w:tab/>
+      </w:r>
+      <w:r>
+        <w:tab/>
+      </w:r>
+      <w:r>
+        <w:tab/>
+      </w:r>
+      <w:r>
+        <w:tab/>
+        <w:t>s.x: (size 4)</w:t>
+      </w:r>
+      <w:r>
+        <w:t xml:space="preserve"> -&gt; </w:t>
+      </w:r>
+      <w:r>
+        <w:rPr>
+          <w:highlight w:val="yellow"/>
+        </w:rPr>
+        <w:t xml:space="preserve">offset </w:t>
+      </w:r>
+      <w:r>
+        <w:rPr>
+          <w:highlight w:val="yellow"/>
+        </w:rPr>
+        <w:t>8</w:t>
+      </w:r>
+    </w:p>
+    <w:p>
+      <w:pPr>
+        <w:tabs>
+          <w:tab w:val="left" w:pos="360"/>
+        </w:tabs>
+      </w:pPr>
+      <w:r>
+        <w:tab/>
+      </w:r>
+      <w:r>
+        <w:tab/>
+      </w:r>
+      <w:r>
+        <w:tab/>
+      </w:r>
+      <w:r>
+        <w:tab/>
+        <w:t>s.</w:t>
+      </w:r>
+      <w:r>
+        <w:t>y</w:t>
+      </w:r>
+      <w:r>
+        <w:t>: (size 4)</w:t>
+      </w:r>
+      <w:r>
+        <w:t xml:space="preserve"> -&gt; </w:t>
+      </w:r>
+      <w:r>
+        <w:rPr>
+          <w:highlight w:val="yellow"/>
+        </w:rPr>
+        <w:t xml:space="preserve">offset </w:t>
+      </w:r>
+      <w:r>
+        <w:rPr>
+          <w:highlight w:val="yellow"/>
+        </w:rPr>
+        <w:t>12</w:t>
+      </w:r>
+    </w:p>
+    <w:p>
+      <w:pPr>
+        <w:tabs>
+          <w:tab w:val="left" w:pos="360"/>
+        </w:tabs>
+      </w:pPr>
+      <w:r>
+        <w:tab/>
+      </w:r>
+      <w:r>
+        <w:tab/>
+      </w:r>
+      <w:r>
+        <w:tab/>
+      </w:r>
+      <w:r>
+        <w:tab/>
+        <w:t>s.</w:t>
+      </w:r>
+      <w:r>
+        <w:t>next</w:t>
+      </w:r>
+      <w:r>
+        <w:t xml:space="preserve">: (size </w:t>
+      </w:r>
+      <w:r>
+        <w:t>8</w:t>
+      </w:r>
+      <w:r>
+        <w:t>)</w:t>
+      </w:r>
+      <w:r>
+        <w:t xml:space="preserve"> -&gt; </w:t>
+      </w:r>
+      <w:r>
+        <w:rPr>
+          <w:highlight w:val="yellow"/>
+        </w:rPr>
+        <w:t>offset 1</w:t>
+      </w:r>
+      <w:r>
+        <w:rPr>
+          <w:highlight w:val="yellow"/>
+        </w:rPr>
+        <w:t>6</w:t>
+      </w:r>
+    </w:p>
+    <w:p>
+      <w:pPr>
+        <w:tabs>
+          <w:tab w:val="left" w:pos="360"/>
+        </w:tabs>
       </w:pPr>
     </w:p>
     <w:p>
@@ -1158,6 +893,15 @@
       <w:r>
         <w:t xml:space="preserve"> How many total bytes does the structure require?</w:t>
       </w:r>
+      <w:r>
+        <w:t xml:space="preserve"> </w:t>
+      </w:r>
+      <w:r>
+        <w:rPr>
+          <w:highlight w:val="yellow"/>
+        </w:rPr>
+        <w:t>24 bytes</w:t>
+      </w:r>
     </w:p>
     <w:p>
       <w:pPr>
@@ -1187,7 +931,6 @@
       <w:r>
         <w:t xml:space="preserve"> The compiler generates the following assembly code for the body of </w:t>
       </w:r>
-      <w:proofErr w:type="spellStart"/>
       <w:r>
         <w:rPr>
           <w:rFonts w:ascii="Courier New" w:hAnsi="Courier New" w:cs="Courier New"/>
@@ -1196,18 +939,7 @@
           <w:sz w:val="20"/>
           <w:szCs w:val="20"/>
         </w:rPr>
-        <w:t>sp_init</w:t>
-      </w:r>
-      <w:proofErr w:type="spellEnd"/>
-      <w:r>
-        <w:rPr>
-          <w:rFonts w:ascii="Courier New" w:hAnsi="Courier New" w:cs="Courier New"/>
-          <w:b/>
-          <w:bCs/>
-          <w:sz w:val="20"/>
-          <w:szCs w:val="20"/>
-        </w:rPr>
-        <w:t>:</w:t>
+        <w:t>sp_init:</w:t>
       </w:r>
     </w:p>
     <w:p>
@@ -1248,44 +980,21 @@
         <w:rPr>
           <w:rFonts w:ascii="Courier New" w:hAnsi="Courier New" w:cs="Courier New"/>
         </w:rPr>
+        <w:t xml:space="preserve"> sp_init:               #</w:t>
+      </w:r>
+      <w:r>
+        <w:rPr>
+          <w:rFonts w:ascii="Courier New" w:hAnsi="Courier New" w:cs="Courier New"/>
+        </w:rPr>
         <w:t xml:space="preserve"> </w:t>
       </w:r>
-      <w:proofErr w:type="spellStart"/>
-      <w:r>
-        <w:rPr>
-          <w:rFonts w:ascii="Courier New" w:hAnsi="Courier New" w:cs="Courier New"/>
-        </w:rPr>
-        <w:t>sp_</w:t>
-      </w:r>
-      <w:proofErr w:type="gramStart"/>
-      <w:r>
-        <w:rPr>
-          <w:rFonts w:ascii="Courier New" w:hAnsi="Courier New" w:cs="Courier New"/>
-        </w:rPr>
-        <w:t>init</w:t>
-      </w:r>
-      <w:proofErr w:type="spellEnd"/>
-      <w:r>
-        <w:rPr>
-          <w:rFonts w:ascii="Courier New" w:hAnsi="Courier New" w:cs="Courier New"/>
-        </w:rPr>
-        <w:t>:               #</w:t>
-      </w:r>
-      <w:proofErr w:type="gramEnd"/>
-      <w:r>
-        <w:rPr>
-          <w:rFonts w:ascii="Courier New" w:hAnsi="Courier New" w:cs="Courier New"/>
-        </w:rPr>
-        <w:t>sp is in %</w:t>
-      </w:r>
-      <w:proofErr w:type="spellStart"/>
-      <w:r>
-        <w:rPr>
-          <w:rFonts w:ascii="Courier New" w:hAnsi="Courier New" w:cs="Courier New"/>
-        </w:rPr>
-        <w:t>rdi</w:t>
-      </w:r>
-      <w:proofErr w:type="spellEnd"/>
+      <w:r>
+        <w:rPr>
+          <w:rFonts w:ascii="Courier New" w:hAnsi="Courier New" w:cs="Courier New"/>
+          <w:highlight w:val="yellow"/>
+        </w:rPr>
+        <w:t>sp is in %rdi</w:t>
+      </w:r>
     </w:p>
     <w:p>
       <w:pPr>
@@ -1304,55 +1013,31 @@
         </w:rPr>
         <w:t xml:space="preserve">      </w:t>
       </w:r>
-      <w:proofErr w:type="spellStart"/>
-      <w:r>
-        <w:rPr>
-          <w:rFonts w:ascii="Courier New" w:hAnsi="Courier New" w:cs="Courier New"/>
-        </w:rPr>
-        <w:t>movl</w:t>
-      </w:r>
-      <w:proofErr w:type="spellEnd"/>
-      <w:r>
-        <w:rPr>
-          <w:rFonts w:ascii="Courier New" w:hAnsi="Courier New" w:cs="Courier New"/>
-        </w:rPr>
-        <w:t xml:space="preserve"> 12(%</w:t>
-      </w:r>
-      <w:proofErr w:type="spellStart"/>
-      <w:r>
-        <w:rPr>
-          <w:rFonts w:ascii="Courier New" w:hAnsi="Courier New" w:cs="Courier New"/>
-        </w:rPr>
-        <w:t>rdi</w:t>
-      </w:r>
-      <w:proofErr w:type="spellEnd"/>
-      <w:proofErr w:type="gramStart"/>
-      <w:r>
-        <w:rPr>
-          <w:rFonts w:ascii="Courier New" w:hAnsi="Courier New" w:cs="Courier New"/>
-        </w:rPr>
-        <w:t>),%</w:t>
-      </w:r>
-      <w:proofErr w:type="spellStart"/>
-      <w:r>
-        <w:rPr>
-          <w:rFonts w:ascii="Courier New" w:hAnsi="Courier New" w:cs="Courier New"/>
-        </w:rPr>
-        <w:t>eax</w:t>
-      </w:r>
-      <w:proofErr w:type="spellEnd"/>
-      <w:r>
-        <w:rPr>
-          <w:rFonts w:ascii="Courier New" w:hAnsi="Courier New" w:cs="Courier New"/>
-        </w:rPr>
-        <w:t xml:space="preserve">  #</w:t>
-      </w:r>
-      <w:proofErr w:type="gramEnd"/>
-      <w:r>
-        <w:rPr>
-          <w:rFonts w:ascii="Courier New" w:hAnsi="Courier New" w:cs="Courier New"/>
-        </w:rPr>
-        <w:t>______________________________</w:t>
+      <w:r>
+        <w:rPr>
+          <w:rFonts w:ascii="Courier New" w:hAnsi="Courier New" w:cs="Courier New"/>
+        </w:rPr>
+        <w:t>movl 12(%rdi),%eax  #</w:t>
+      </w:r>
+      <w:r>
+        <w:rPr>
+          <w:rFonts w:ascii="Courier New" w:hAnsi="Courier New" w:cs="Courier New"/>
+        </w:rPr>
+        <w:t xml:space="preserve"> </w:t>
+      </w:r>
+      <w:r>
+        <w:rPr>
+          <w:rFonts w:ascii="Courier New" w:hAnsi="Courier New" w:cs="Courier New"/>
+          <w:highlight w:val="yellow"/>
+        </w:rPr>
+        <w:t xml:space="preserve">move </w:t>
+      </w:r>
+      <w:r>
+        <w:rPr>
+          <w:rFonts w:ascii="Courier New" w:hAnsi="Courier New" w:cs="Courier New"/>
+          <w:highlight w:val="yellow"/>
+        </w:rPr>
+        <w:t>s.y into %eax</w:t>
       </w:r>
     </w:p>
     <w:p>
@@ -1370,43 +1055,33 @@
         <w:rPr>
           <w:rFonts w:ascii="Courier New" w:hAnsi="Courier New" w:cs="Courier New"/>
         </w:rPr>
-        <w:t xml:space="preserve">      </w:t>
-      </w:r>
-      <w:proofErr w:type="spellStart"/>
-      <w:r>
-        <w:rPr>
-          <w:rFonts w:ascii="Courier New" w:hAnsi="Courier New" w:cs="Courier New"/>
-        </w:rPr>
-        <w:t>movl</w:t>
-      </w:r>
-      <w:proofErr w:type="spellEnd"/>
-      <w:r>
-        <w:rPr>
-          <w:rFonts w:ascii="Courier New" w:hAnsi="Courier New" w:cs="Courier New"/>
-        </w:rPr>
-        <w:t xml:space="preserve"> %eax,8(%</w:t>
-      </w:r>
-      <w:proofErr w:type="spellStart"/>
-      <w:proofErr w:type="gramStart"/>
-      <w:r>
-        <w:rPr>
-          <w:rFonts w:ascii="Courier New" w:hAnsi="Courier New" w:cs="Courier New"/>
-        </w:rPr>
-        <w:t>rdi</w:t>
-      </w:r>
-      <w:proofErr w:type="spellEnd"/>
-      <w:r>
-        <w:rPr>
-          <w:rFonts w:ascii="Courier New" w:hAnsi="Courier New" w:cs="Courier New"/>
-        </w:rPr>
-        <w:t xml:space="preserve">)   </w:t>
-      </w:r>
-      <w:proofErr w:type="gramEnd"/>
-      <w:r>
-        <w:rPr>
-          <w:rFonts w:ascii="Courier New" w:hAnsi="Courier New" w:cs="Courier New"/>
-        </w:rPr>
-        <w:t xml:space="preserve">#______________________________ </w:t>
+        <w:t xml:space="preserve">      movl %eax,8(%rdi)   #</w:t>
+      </w:r>
+      <w:r>
+        <w:rPr>
+          <w:rFonts w:ascii="Courier New" w:hAnsi="Courier New" w:cs="Courier New"/>
+        </w:rPr>
+        <w:t xml:space="preserve"> </w:t>
+      </w:r>
+      <w:r>
+        <w:rPr>
+          <w:rFonts w:ascii="Courier New" w:hAnsi="Courier New" w:cs="Courier New"/>
+          <w:highlight w:val="yellow"/>
+        </w:rPr>
+        <w:t xml:space="preserve">move </w:t>
+      </w:r>
+      <w:r>
+        <w:rPr>
+          <w:rFonts w:ascii="Courier New" w:hAnsi="Courier New" w:cs="Courier New"/>
+          <w:highlight w:val="yellow"/>
+        </w:rPr>
+        <w:t>s.y into s.x</w:t>
+      </w:r>
+      <w:r>
+        <w:rPr>
+          <w:rFonts w:ascii="Courier New" w:hAnsi="Courier New" w:cs="Courier New"/>
+        </w:rPr>
+        <w:t xml:space="preserve"> </w:t>
       </w:r>
     </w:p>
     <w:p>
@@ -1426,44 +1101,12 @@
         </w:rPr>
         <w:t xml:space="preserve">      </w:t>
       </w:r>
-      <w:proofErr w:type="spellStart"/>
-      <w:r>
-        <w:rPr>
-          <w:rFonts w:ascii="Courier New" w:hAnsi="Courier New" w:cs="Courier New"/>
-        </w:rPr>
-        <w:t>leaq</w:t>
-      </w:r>
-      <w:proofErr w:type="spellEnd"/>
-      <w:r>
-        <w:rPr>
-          <w:rFonts w:ascii="Courier New" w:hAnsi="Courier New" w:cs="Courier New"/>
-        </w:rPr>
-        <w:t xml:space="preserve"> 8(%</w:t>
-      </w:r>
-      <w:proofErr w:type="spellStart"/>
-      <w:r>
-        <w:rPr>
-          <w:rFonts w:ascii="Courier New" w:hAnsi="Courier New" w:cs="Courier New"/>
-        </w:rPr>
-        <w:t>rdi</w:t>
-      </w:r>
-      <w:proofErr w:type="spellEnd"/>
-      <w:proofErr w:type="gramStart"/>
-      <w:r>
-        <w:rPr>
-          <w:rFonts w:ascii="Courier New" w:hAnsi="Courier New" w:cs="Courier New"/>
-        </w:rPr>
-        <w:t>),%</w:t>
-      </w:r>
-      <w:proofErr w:type="spellStart"/>
-      <w:proofErr w:type="gramEnd"/>
-      <w:r>
-        <w:rPr>
-          <w:rFonts w:ascii="Courier New" w:hAnsi="Courier New" w:cs="Courier New"/>
-        </w:rPr>
-        <w:t>rax</w:t>
-      </w:r>
-      <w:proofErr w:type="spellEnd"/>
+      <w:r>
+        <w:rPr>
+          <w:rFonts w:ascii="Courier New" w:hAnsi="Courier New" w:cs="Courier New"/>
+        </w:rPr>
+        <w:t>leaq 8(%rdi),%rax</w:t>
+      </w:r>
       <w:r>
         <w:rPr>
           <w:rFonts w:ascii="Courier New" w:hAnsi="Courier New" w:cs="Courier New"/>
@@ -1486,7 +1129,41 @@
         <w:rPr>
           <w:rFonts w:ascii="Courier New" w:hAnsi="Courier New" w:cs="Courier New"/>
         </w:rPr>
-        <w:t>#______________________________</w:t>
+        <w:t>#</w:t>
+      </w:r>
+      <w:r>
+        <w:rPr>
+          <w:rFonts w:ascii="Courier New" w:hAnsi="Courier New" w:cs="Courier New"/>
+        </w:rPr>
+        <w:t xml:space="preserve"> </w:t>
+      </w:r>
+      <w:r>
+        <w:rPr>
+          <w:rFonts w:ascii="Courier New" w:hAnsi="Courier New" w:cs="Courier New"/>
+          <w:highlight w:val="yellow"/>
+        </w:rPr>
+        <w:t xml:space="preserve">store </w:t>
+      </w:r>
+      <w:r>
+        <w:rPr>
+          <w:rFonts w:ascii="Courier New" w:hAnsi="Courier New" w:cs="Courier New"/>
+          <w:highlight w:val="yellow"/>
+        </w:rPr>
+        <w:t>address</w:t>
+      </w:r>
+      <w:r>
+        <w:rPr>
+          <w:rFonts w:ascii="Courier New" w:hAnsi="Courier New" w:cs="Courier New"/>
+          <w:highlight w:val="yellow"/>
+        </w:rPr>
+        <w:t xml:space="preserve"> of </w:t>
+      </w:r>
+      <w:r>
+        <w:rPr>
+          <w:rFonts w:ascii="Courier New" w:hAnsi="Courier New" w:cs="Courier New"/>
+          <w:highlight w:val="yellow"/>
+        </w:rPr>
+        <w:t>s.x in %rax</w:t>
       </w:r>
     </w:p>
     <w:p>
@@ -1504,65 +1181,55 @@
         <w:rPr>
           <w:rFonts w:ascii="Courier New" w:hAnsi="Courier New" w:cs="Courier New"/>
         </w:rPr>
-        <w:t xml:space="preserve">      </w:t>
-      </w:r>
-      <w:proofErr w:type="spellStart"/>
-      <w:r>
-        <w:rPr>
-          <w:rFonts w:ascii="Courier New" w:hAnsi="Courier New" w:cs="Courier New"/>
-        </w:rPr>
-        <w:t>movq</w:t>
-      </w:r>
-      <w:proofErr w:type="spellEnd"/>
-      <w:r>
-        <w:rPr>
-          <w:rFonts w:ascii="Courier New" w:hAnsi="Courier New" w:cs="Courier New"/>
-        </w:rPr>
-        <w:t xml:space="preserve"> %</w:t>
-      </w:r>
-      <w:proofErr w:type="spellStart"/>
-      <w:proofErr w:type="gramStart"/>
-      <w:r>
-        <w:rPr>
-          <w:rFonts w:ascii="Courier New" w:hAnsi="Courier New" w:cs="Courier New"/>
-        </w:rPr>
-        <w:t>rax</w:t>
-      </w:r>
-      <w:proofErr w:type="spellEnd"/>
-      <w:r>
-        <w:rPr>
-          <w:rFonts w:ascii="Courier New" w:hAnsi="Courier New" w:cs="Courier New"/>
-        </w:rPr>
-        <w:t>,(</w:t>
-      </w:r>
-      <w:proofErr w:type="gramEnd"/>
-      <w:r>
-        <w:rPr>
-          <w:rFonts w:ascii="Courier New" w:hAnsi="Courier New" w:cs="Courier New"/>
-        </w:rPr>
-        <w:t>%</w:t>
-      </w:r>
-      <w:proofErr w:type="spellStart"/>
-      <w:proofErr w:type="gramStart"/>
-      <w:r>
-        <w:rPr>
-          <w:rFonts w:ascii="Courier New" w:hAnsi="Courier New" w:cs="Courier New"/>
-        </w:rPr>
-        <w:t>rdi</w:t>
-      </w:r>
-      <w:proofErr w:type="spellEnd"/>
-      <w:r>
-        <w:rPr>
-          <w:rFonts w:ascii="Courier New" w:hAnsi="Courier New" w:cs="Courier New"/>
-        </w:rPr>
-        <w:t xml:space="preserve">)   </w:t>
-      </w:r>
-      <w:proofErr w:type="gramEnd"/>
-      <w:r>
-        <w:rPr>
-          <w:rFonts w:ascii="Courier New" w:hAnsi="Courier New" w:cs="Courier New"/>
-        </w:rPr>
-        <w:t xml:space="preserve"> #______________________________</w:t>
+        <w:t xml:space="preserve">      movq %rax,(%rdi)    #</w:t>
+      </w:r>
+      <w:r>
+        <w:rPr>
+          <w:rFonts w:ascii="Courier New" w:hAnsi="Courier New" w:cs="Courier New"/>
+        </w:rPr>
+        <w:t xml:space="preserve"> </w:t>
+      </w:r>
+      <w:r>
+        <w:rPr>
+          <w:rFonts w:ascii="Courier New" w:hAnsi="Courier New" w:cs="Courier New"/>
+          <w:highlight w:val="yellow"/>
+        </w:rPr>
+        <w:t>move</w:t>
+      </w:r>
+      <w:r>
+        <w:rPr>
+          <w:rFonts w:ascii="Courier New" w:hAnsi="Courier New" w:cs="Courier New"/>
+          <w:highlight w:val="yellow"/>
+        </w:rPr>
+        <w:t xml:space="preserve"> </w:t>
+      </w:r>
+      <w:r>
+        <w:rPr>
+          <w:rFonts w:ascii="Courier New" w:hAnsi="Courier New" w:cs="Courier New"/>
+          <w:highlight w:val="yellow"/>
+        </w:rPr>
+        <w:t>address</w:t>
+      </w:r>
+      <w:r>
+        <w:rPr>
+          <w:rFonts w:ascii="Courier New" w:hAnsi="Courier New" w:cs="Courier New"/>
+          <w:highlight w:val="yellow"/>
+        </w:rPr>
+        <w:t xml:space="preserve"> of </w:t>
+      </w:r>
+      <w:r>
+        <w:rPr>
+          <w:rFonts w:ascii="Courier New" w:hAnsi="Courier New" w:cs="Courier New"/>
+          <w:highlight w:val="yellow"/>
+        </w:rPr>
+        <w:t>s.x into</w:t>
+      </w:r>
+      <w:r>
+        <w:rPr>
+          <w:rFonts w:ascii="Courier New" w:hAnsi="Courier New" w:cs="Courier New"/>
+          <w:highlight w:val="yellow"/>
+        </w:rPr>
+        <w:t xml:space="preserve"> p</w:t>
       </w:r>
     </w:p>
     <w:p>
@@ -1580,43 +1247,34 @@
         <w:rPr>
           <w:rFonts w:ascii="Courier New" w:hAnsi="Courier New" w:cs="Courier New"/>
         </w:rPr>
-        <w:t xml:space="preserve">      </w:t>
-      </w:r>
-      <w:proofErr w:type="spellStart"/>
-      <w:r>
-        <w:rPr>
-          <w:rFonts w:ascii="Courier New" w:hAnsi="Courier New" w:cs="Courier New"/>
-        </w:rPr>
-        <w:t>movq</w:t>
-      </w:r>
-      <w:proofErr w:type="spellEnd"/>
-      <w:r>
-        <w:rPr>
-          <w:rFonts w:ascii="Courier New" w:hAnsi="Courier New" w:cs="Courier New"/>
-        </w:rPr>
-        <w:t xml:space="preserve"> %rdi,16(%</w:t>
-      </w:r>
-      <w:proofErr w:type="spellStart"/>
-      <w:proofErr w:type="gramStart"/>
-      <w:r>
-        <w:rPr>
-          <w:rFonts w:ascii="Courier New" w:hAnsi="Courier New" w:cs="Courier New"/>
-        </w:rPr>
-        <w:t>rdi</w:t>
-      </w:r>
-      <w:proofErr w:type="spellEnd"/>
-      <w:r>
-        <w:rPr>
-          <w:rFonts w:ascii="Courier New" w:hAnsi="Courier New" w:cs="Courier New"/>
-        </w:rPr>
-        <w:t>)  #</w:t>
-      </w:r>
-      <w:proofErr w:type="gramEnd"/>
-      <w:r>
-        <w:rPr>
-          <w:rFonts w:ascii="Courier New" w:hAnsi="Courier New" w:cs="Courier New"/>
-        </w:rPr>
-        <w:t>______________________________</w:t>
+        <w:t xml:space="preserve">      movq %rdi,16(%rdi)  #</w:t>
+      </w:r>
+      <w:r>
+        <w:rPr>
+          <w:rFonts w:ascii="Courier New" w:hAnsi="Courier New" w:cs="Courier New"/>
+        </w:rPr>
+        <w:t xml:space="preserve"> </w:t>
+      </w:r>
+      <w:r>
+        <w:rPr>
+          <w:rFonts w:ascii="Courier New" w:hAnsi="Courier New" w:cs="Courier New"/>
+          <w:highlight w:val="yellow"/>
+        </w:rPr>
+        <w:t xml:space="preserve">next = </w:t>
+      </w:r>
+      <w:r>
+        <w:rPr>
+          <w:rFonts w:ascii="Courier New" w:hAnsi="Courier New" w:cs="Courier New"/>
+          <w:highlight w:val="yellow"/>
+        </w:rPr>
+        <w:t>s</w:t>
+      </w:r>
+      <w:r>
+        <w:rPr>
+          <w:rFonts w:ascii="Courier New" w:hAnsi="Courier New" w:cs="Courier New"/>
+          <w:highlight w:val="yellow"/>
+        </w:rPr>
+        <w:t>p</w:t>
       </w:r>
     </w:p>
     <w:p>
@@ -1638,18 +1296,8 @@
           <w:sz w:val="20"/>
           <w:szCs w:val="20"/>
         </w:rPr>
-        <w:t xml:space="preserve">      </w:t>
-      </w:r>
-      <w:proofErr w:type="gramStart"/>
-      <w:r>
-        <w:rPr>
-          <w:rFonts w:ascii="Courier New" w:hAnsi="Courier New" w:cs="Courier New"/>
-          <w:sz w:val="20"/>
-          <w:szCs w:val="20"/>
-        </w:rPr>
-        <w:t>ret</w:t>
-      </w:r>
-      <w:proofErr w:type="gramEnd"/>
+        <w:t xml:space="preserve">      ret</w:t>
+      </w:r>
       <w:r>
         <w:rPr>
           <w:rFonts w:ascii="Courier New" w:hAnsi="Courier New" w:cs="Courier New"/>
@@ -1668,23 +1316,9 @@
       <w:pPr>
         <w:ind w:left="1125"/>
       </w:pPr>
-      <w:proofErr w:type="gramStart"/>
-      <w:r>
-        <w:t>On the basis of</w:t>
-      </w:r>
-      <w:proofErr w:type="gramEnd"/>
-      <w:r>
-        <w:t xml:space="preserve"> this information, annotate the code, </w:t>
-      </w:r>
-      <w:proofErr w:type="gramStart"/>
-      <w:r>
-        <w:t>similar to</w:t>
-      </w:r>
-      <w:proofErr w:type="gramEnd"/>
-      <w:r>
-        <w:t xml:space="preserve"> what the textbook would do, and fill in the three missing expressions in the code above for </w:t>
-      </w:r>
-      <w:proofErr w:type="spellStart"/>
+      <w:r>
+        <w:t xml:space="preserve">On the basis of this information, annotate the code, similar to what the textbook would do, and fill in the three missing expressions in the code above for </w:t>
+      </w:r>
       <w:r>
         <w:rPr>
           <w:rFonts w:ascii="Courier New" w:hAnsi="Courier New" w:cs="Courier New"/>
@@ -1693,7 +1327,6 @@
         </w:rPr>
         <w:t>sp_init</w:t>
       </w:r>
-      <w:proofErr w:type="spellEnd"/>
       <w:r>
         <w:t>.</w:t>
       </w:r>
@@ -1726,23 +1359,7 @@
           <w:b/>
           <w:u w:val="single"/>
         </w:rPr>
-        <w:t xml:space="preserve">Problem </w:t>
-      </w:r>
-      <w:proofErr w:type="gramStart"/>
-      <w:r>
-        <w:rPr>
-          <w:b/>
-          <w:u w:val="single"/>
-        </w:rPr>
-        <w:t>on</w:t>
-      </w:r>
-      <w:proofErr w:type="gramEnd"/>
-      <w:r>
-        <w:rPr>
-          <w:b/>
-          <w:u w:val="single"/>
-        </w:rPr>
-        <w:t xml:space="preserve"> Union Declarations</w:t>
+        <w:t>Problem on Union Declarations</w:t>
       </w:r>
     </w:p>
     <w:p>
@@ -1778,25 +1395,7 @@
           <w:sz w:val="20"/>
           <w:szCs w:val="20"/>
         </w:rPr>
-        <w:t xml:space="preserve">union </w:t>
-      </w:r>
-      <w:proofErr w:type="spellStart"/>
-      <w:r>
-        <w:rPr>
-          <w:rFonts w:ascii="Courier New" w:hAnsi="Courier New" w:cs="Courier New"/>
-          <w:sz w:val="20"/>
-          <w:szCs w:val="20"/>
-        </w:rPr>
-        <w:t>ele</w:t>
-      </w:r>
-      <w:proofErr w:type="spellEnd"/>
-      <w:r>
-        <w:rPr>
-          <w:rFonts w:ascii="Courier New" w:hAnsi="Courier New" w:cs="Courier New"/>
-          <w:sz w:val="20"/>
-          <w:szCs w:val="20"/>
-        </w:rPr>
-        <w:t xml:space="preserve"> {</w:t>
+        <w:t>union ele {</w:t>
       </w:r>
     </w:p>
     <w:p>
@@ -1879,18 +1478,8 @@
           <w:sz w:val="20"/>
           <w:szCs w:val="20"/>
         </w:rPr>
-        <w:t xml:space="preserve"> *</w:t>
-      </w:r>
-      <w:proofErr w:type="gramStart"/>
-      <w:r>
-        <w:rPr>
-          <w:rFonts w:ascii="Courier New" w:hAnsi="Courier New" w:cs="Courier New"/>
-          <w:sz w:val="20"/>
-          <w:szCs w:val="20"/>
-        </w:rPr>
-        <w:t>p;</w:t>
-      </w:r>
-      <w:proofErr w:type="gramEnd"/>
+        <w:t xml:space="preserve"> *p;</w:t>
+      </w:r>
     </w:p>
     <w:p>
       <w:pPr>
@@ -1943,18 +1532,8 @@
           <w:sz w:val="20"/>
           <w:szCs w:val="20"/>
         </w:rPr>
-        <w:t xml:space="preserve"> </w:t>
-      </w:r>
-      <w:proofErr w:type="gramStart"/>
-      <w:r>
-        <w:rPr>
-          <w:rFonts w:ascii="Courier New" w:hAnsi="Courier New" w:cs="Courier New"/>
-          <w:sz w:val="20"/>
-          <w:szCs w:val="20"/>
-        </w:rPr>
-        <w:t>y;</w:t>
-      </w:r>
-      <w:proofErr w:type="gramEnd"/>
+        <w:t xml:space="preserve"> y;</w:t>
+      </w:r>
     </w:p>
     <w:p>
       <w:pPr>
@@ -1991,28 +1570,8 @@
           <w:sz w:val="20"/>
           <w:szCs w:val="20"/>
         </w:rPr>
-        <w:t xml:space="preserve">} </w:t>
-      </w:r>
-      <w:proofErr w:type="spellStart"/>
-      <w:proofErr w:type="gramStart"/>
-      <w:r>
-        <w:rPr>
-          <w:rFonts w:ascii="Courier New" w:hAnsi="Courier New" w:cs="Courier New"/>
-          <w:sz w:val="20"/>
-          <w:szCs w:val="20"/>
-        </w:rPr>
-        <w:t>el</w:t>
-      </w:r>
-      <w:proofErr w:type="spellEnd"/>
-      <w:r>
-        <w:rPr>
-          <w:rFonts w:ascii="Courier New" w:hAnsi="Courier New" w:cs="Courier New"/>
-          <w:sz w:val="20"/>
-          <w:szCs w:val="20"/>
-        </w:rPr>
-        <w:t>;</w:t>
-      </w:r>
-      <w:proofErr w:type="gramEnd"/>
+        <w:t>} el;</w:t>
+      </w:r>
     </w:p>
     <w:p>
       <w:pPr>
@@ -2103,18 +1662,8 @@
           <w:sz w:val="20"/>
           <w:szCs w:val="20"/>
         </w:rPr>
-        <w:t xml:space="preserve"> </w:t>
-      </w:r>
-      <w:proofErr w:type="gramStart"/>
-      <w:r>
-        <w:rPr>
-          <w:rFonts w:ascii="Courier New" w:hAnsi="Courier New" w:cs="Courier New"/>
-          <w:sz w:val="20"/>
-          <w:szCs w:val="20"/>
-        </w:rPr>
-        <w:t>x;</w:t>
-      </w:r>
-      <w:proofErr w:type="gramEnd"/>
+        <w:t xml:space="preserve"> x;</w:t>
+      </w:r>
     </w:p>
     <w:p>
       <w:pPr>
@@ -2159,36 +1708,8 @@
           <w:sz w:val="20"/>
           <w:szCs w:val="20"/>
         </w:rPr>
-        <w:t xml:space="preserve">union </w:t>
-      </w:r>
-      <w:proofErr w:type="spellStart"/>
-      <w:r>
-        <w:rPr>
-          <w:rFonts w:ascii="Courier New" w:hAnsi="Courier New" w:cs="Courier New"/>
-          <w:sz w:val="20"/>
-          <w:szCs w:val="20"/>
-        </w:rPr>
-        <w:t>ele</w:t>
-      </w:r>
-      <w:proofErr w:type="spellEnd"/>
-      <w:r>
-        <w:rPr>
-          <w:rFonts w:ascii="Courier New" w:hAnsi="Courier New" w:cs="Courier New"/>
-          <w:sz w:val="20"/>
-          <w:szCs w:val="20"/>
-        </w:rPr>
-        <w:t xml:space="preserve"> *</w:t>
-      </w:r>
-      <w:proofErr w:type="gramStart"/>
-      <w:r>
-        <w:rPr>
-          <w:rFonts w:ascii="Courier New" w:hAnsi="Courier New" w:cs="Courier New"/>
-          <w:sz w:val="20"/>
-          <w:szCs w:val="20"/>
-        </w:rPr>
-        <w:t>next;</w:t>
-      </w:r>
-      <w:proofErr w:type="gramEnd"/>
+        <w:t>union ele *next;</w:t>
+      </w:r>
     </w:p>
     <w:p>
       <w:pPr>
@@ -2225,18 +1746,8 @@
           <w:sz w:val="20"/>
           <w:szCs w:val="20"/>
         </w:rPr>
-        <w:t xml:space="preserve">} </w:t>
-      </w:r>
-      <w:proofErr w:type="gramStart"/>
-      <w:r>
-        <w:rPr>
-          <w:rFonts w:ascii="Courier New" w:hAnsi="Courier New" w:cs="Courier New"/>
-          <w:sz w:val="20"/>
-          <w:szCs w:val="20"/>
-        </w:rPr>
-        <w:t>e2;</w:t>
-      </w:r>
-      <w:proofErr w:type="gramEnd"/>
+        <w:t>} e2;</w:t>
+      </w:r>
     </w:p>
     <w:p>
       <w:pPr>
@@ -2251,7 +1762,6 @@
           <w:szCs w:val="20"/>
         </w:rPr>
       </w:pPr>
-      <w:proofErr w:type="gramStart"/>
       <w:r>
         <w:rPr>
           <w:rFonts w:ascii="Courier New" w:hAnsi="Courier New" w:cs="Courier New"/>
@@ -2260,7 +1770,6 @@
         </w:rPr>
         <w:t>};</w:t>
       </w:r>
-      <w:proofErr w:type="gramEnd"/>
       <w:r>
         <w:rPr>
           <w:rFonts w:ascii="Courier New" w:hAnsi="Courier New" w:cs="Courier New"/>
@@ -2328,37 +1837,18 @@
           <w:sz w:val="20"/>
           <w:szCs w:val="20"/>
         </w:rPr>
-        <w:t xml:space="preserve">void proc (union </w:t>
-      </w:r>
-      <w:proofErr w:type="spellStart"/>
-      <w:r>
-        <w:rPr>
-          <w:rFonts w:ascii="Courier New" w:hAnsi="Courier New" w:cs="Courier New"/>
-          <w:sz w:val="20"/>
-          <w:szCs w:val="20"/>
-        </w:rPr>
-        <w:t>ele</w:t>
-      </w:r>
-      <w:proofErr w:type="spellEnd"/>
-      <w:r>
-        <w:rPr>
-          <w:rFonts w:ascii="Courier New" w:hAnsi="Courier New" w:cs="Courier New"/>
-          <w:sz w:val="20"/>
-          <w:szCs w:val="20"/>
-        </w:rPr>
-        <w:t xml:space="preserve"> *up)</w:t>
-      </w:r>
-    </w:p>
-    <w:p>
-      <w:pPr>
-        <w:ind w:left="720"/>
-        <w:rPr>
-          <w:rFonts w:ascii="Courier New" w:hAnsi="Courier New" w:cs="Courier New"/>
-          <w:sz w:val="20"/>
-          <w:szCs w:val="20"/>
-        </w:rPr>
-      </w:pPr>
-      <w:proofErr w:type="gramStart"/>
+        <w:t>void proc (union ele *up)</w:t>
+      </w:r>
+    </w:p>
+    <w:p>
+      <w:pPr>
+        <w:ind w:left="720"/>
+        <w:rPr>
+          <w:rFonts w:ascii="Courier New" w:hAnsi="Courier New" w:cs="Courier New"/>
+          <w:sz w:val="20"/>
+          <w:szCs w:val="20"/>
+        </w:rPr>
+      </w:pPr>
       <w:r>
         <w:rPr>
           <w:rFonts w:ascii="Courier New" w:hAnsi="Courier New" w:cs="Courier New"/>
@@ -2373,16 +1863,7 @@
           <w:sz w:val="20"/>
           <w:szCs w:val="20"/>
         </w:rPr>
-        <w:t xml:space="preserve">  </w:t>
-      </w:r>
-      <w:proofErr w:type="gramEnd"/>
-      <w:r>
-        <w:rPr>
-          <w:rFonts w:ascii="Courier New" w:hAnsi="Courier New" w:cs="Courier New"/>
-          <w:sz w:val="20"/>
-          <w:szCs w:val="20"/>
-        </w:rPr>
-        <w:t xml:space="preserve">                </w:t>
+        <w:t xml:space="preserve">                  </w:t>
       </w:r>
       <w:r>
         <w:rPr>
@@ -2492,7 +1973,6 @@
         </w:rPr>
         <w:tab/>
       </w:r>
-      <w:proofErr w:type="gramStart"/>
       <w:r>
         <w:rPr>
           <w:rFonts w:ascii="Courier New" w:hAnsi="Courier New" w:cs="Courier New"/>
@@ -2524,16 +2004,7 @@
           <w:sz w:val="20"/>
           <w:szCs w:val="20"/>
         </w:rPr>
-        <w:t xml:space="preserve"> </w:t>
-      </w:r>
-      <w:proofErr w:type="gramEnd"/>
-      <w:r>
-        <w:rPr>
-          <w:rFonts w:ascii="Courier New" w:hAnsi="Courier New" w:cs="Courier New"/>
-          <w:sz w:val="20"/>
-          <w:szCs w:val="20"/>
-        </w:rPr>
-        <w:t xml:space="preserve">   </w:t>
+        <w:t xml:space="preserve">    </w:t>
       </w:r>
       <w:r>
         <w:rPr>
@@ -2599,23 +2070,7 @@
         <w:t>(4)</w:t>
       </w:r>
       <w:r>
-        <w:t xml:space="preserve"> What would be the offsets (in bytes) of the following fields for the union (consider the union and alignment when figuring out where the e2.x and e</w:t>
-      </w:r>
-      <w:proofErr w:type="gramStart"/>
-      <w:r>
-        <w:t>2.next</w:t>
-      </w:r>
-      <w:proofErr w:type="gramEnd"/>
-      <w:r>
-        <w:t xml:space="preserve"> </w:t>
-      </w:r>
-      <w:proofErr w:type="gramStart"/>
-      <w:r>
-        <w:t>starts</w:t>
-      </w:r>
-      <w:proofErr w:type="gramEnd"/>
-      <w:r>
-        <w:t>):</w:t>
+        <w:t xml:space="preserve"> What would be the offsets (in bytes) of the following fields for the union (consider the union and alignment when figuring out where the e2.x and e2.next starts):</w:t>
       </w:r>
     </w:p>
     <w:p>
@@ -2623,263 +2078,80 @@
         <w:ind w:left="1440"/>
       </w:pPr>
     </w:p>
-    <w:tbl>
-      <w:tblPr>
-        <w:tblW w:w="0" w:type="auto"/>
-        <w:tblInd w:w="1440" w:type="dxa"/>
-        <w:tblBorders>
-          <w:insideV w:val="single" w:sz="4" w:space="0" w:color="auto"/>
-        </w:tblBorders>
-        <w:tblLook w:val="04A0" w:firstRow="1" w:lastRow="0" w:firstColumn="1" w:lastColumn="0" w:noHBand="0" w:noVBand="1"/>
-      </w:tblPr>
-      <w:tblGrid>
-        <w:gridCol w:w="1458"/>
-      </w:tblGrid>
-      <w:tr>
-        <w:trPr>
-          <w:trHeight w:val="275"/>
-        </w:trPr>
-        <w:tc>
-          <w:tcPr>
-            <w:tcW w:w="1458" w:type="dxa"/>
-            <w:vAlign w:val="center"/>
-          </w:tcPr>
-          <w:p>
-            <w:pPr>
-              <w:tabs>
-                <w:tab w:val="left" w:pos="360"/>
-              </w:tabs>
-              <w:jc w:val="right"/>
-              <w:rPr>
-                <w:rFonts w:ascii="Courier New" w:hAnsi="Courier New" w:cs="Courier New"/>
-                <w:sz w:val="20"/>
-                <w:szCs w:val="20"/>
-              </w:rPr>
-            </w:pPr>
-            <w:proofErr w:type="spellStart"/>
-            <w:proofErr w:type="gramStart"/>
-            <w:r>
-              <w:rPr>
-                <w:rFonts w:ascii="Courier New" w:hAnsi="Courier New" w:cs="Courier New"/>
-                <w:sz w:val="20"/>
-                <w:szCs w:val="20"/>
-              </w:rPr>
-              <w:t>el.</w:t>
-            </w:r>
-            <w:r>
-              <w:rPr>
-                <w:rFonts w:ascii="Courier New" w:hAnsi="Courier New" w:cs="Courier New"/>
-                <w:sz w:val="20"/>
-                <w:szCs w:val="20"/>
-              </w:rPr>
-              <w:t>p</w:t>
-            </w:r>
-            <w:proofErr w:type="spellEnd"/>
-            <w:proofErr w:type="gramEnd"/>
-            <w:r>
-              <w:rPr>
-                <w:rFonts w:ascii="Courier New" w:hAnsi="Courier New" w:cs="Courier New"/>
-                <w:sz w:val="20"/>
-                <w:szCs w:val="20"/>
-              </w:rPr>
-              <w:t>:</w:t>
-            </w:r>
-          </w:p>
-        </w:tc>
-      </w:tr>
-      <w:tr>
-        <w:trPr>
-          <w:trHeight w:val="275"/>
-        </w:trPr>
-        <w:tc>
-          <w:tcPr>
-            <w:tcW w:w="1458" w:type="dxa"/>
-            <w:vAlign w:val="center"/>
-          </w:tcPr>
-          <w:p>
-            <w:pPr>
-              <w:tabs>
-                <w:tab w:val="left" w:pos="360"/>
-              </w:tabs>
-              <w:jc w:val="right"/>
-              <w:rPr>
-                <w:rFonts w:ascii="Courier New" w:hAnsi="Courier New" w:cs="Courier New"/>
-                <w:sz w:val="20"/>
-                <w:szCs w:val="20"/>
-              </w:rPr>
-            </w:pPr>
-            <w:r>
-              <w:rPr>
-                <w:rFonts w:ascii="Courier New" w:hAnsi="Courier New" w:cs="Courier New"/>
-                <w:sz w:val="20"/>
-                <w:szCs w:val="20"/>
-              </w:rPr>
-              <w:t xml:space="preserve">  </w:t>
-            </w:r>
-            <w:proofErr w:type="spellStart"/>
-            <w:proofErr w:type="gramStart"/>
-            <w:r>
-              <w:rPr>
-                <w:rFonts w:ascii="Courier New" w:hAnsi="Courier New" w:cs="Courier New"/>
-                <w:sz w:val="20"/>
-                <w:szCs w:val="20"/>
-              </w:rPr>
-              <w:t>el.y</w:t>
-            </w:r>
-            <w:proofErr w:type="spellEnd"/>
-            <w:proofErr w:type="gramEnd"/>
-            <w:r>
-              <w:rPr>
-                <w:rFonts w:ascii="Courier New" w:hAnsi="Courier New" w:cs="Courier New"/>
-                <w:sz w:val="20"/>
-                <w:szCs w:val="20"/>
-              </w:rPr>
-              <w:t>:</w:t>
-            </w:r>
-          </w:p>
-        </w:tc>
-      </w:tr>
-      <w:tr>
-        <w:trPr>
-          <w:trHeight w:val="257"/>
-        </w:trPr>
-        <w:tc>
-          <w:tcPr>
-            <w:tcW w:w="1458" w:type="dxa"/>
-            <w:vAlign w:val="center"/>
-          </w:tcPr>
-          <w:p>
-            <w:pPr>
-              <w:tabs>
-                <w:tab w:val="left" w:pos="360"/>
-              </w:tabs>
-              <w:jc w:val="right"/>
-              <w:rPr>
-                <w:rFonts w:ascii="Courier New" w:hAnsi="Courier New" w:cs="Courier New"/>
-                <w:sz w:val="20"/>
-                <w:szCs w:val="20"/>
-              </w:rPr>
-            </w:pPr>
-            <w:r>
-              <w:rPr>
-                <w:rFonts w:ascii="Courier New" w:hAnsi="Courier New" w:cs="Courier New"/>
-                <w:sz w:val="20"/>
-                <w:szCs w:val="20"/>
-              </w:rPr>
-              <w:t xml:space="preserve">   </w:t>
-            </w:r>
-            <w:r>
-              <w:rPr>
-                <w:rFonts w:ascii="Courier New" w:hAnsi="Courier New" w:cs="Courier New"/>
-                <w:sz w:val="20"/>
-                <w:szCs w:val="20"/>
-              </w:rPr>
-              <w:t>e2</w:t>
-            </w:r>
-            <w:r>
-              <w:rPr>
-                <w:rFonts w:ascii="Courier New" w:hAnsi="Courier New" w:cs="Courier New"/>
-                <w:sz w:val="20"/>
-                <w:szCs w:val="20"/>
-              </w:rPr>
-              <w:t>.</w:t>
-            </w:r>
-            <w:r>
-              <w:rPr>
-                <w:rFonts w:ascii="Courier New" w:hAnsi="Courier New" w:cs="Courier New"/>
-                <w:sz w:val="20"/>
-                <w:szCs w:val="20"/>
-              </w:rPr>
-              <w:t>x</w:t>
-            </w:r>
-            <w:r>
-              <w:rPr>
-                <w:rFonts w:ascii="Courier New" w:hAnsi="Courier New" w:cs="Courier New"/>
-                <w:sz w:val="20"/>
-                <w:szCs w:val="20"/>
-              </w:rPr>
-              <w:t>:</w:t>
-            </w:r>
-          </w:p>
-        </w:tc>
-      </w:tr>
-      <w:tr>
-        <w:trPr>
-          <w:trHeight w:val="275"/>
-        </w:trPr>
-        <w:tc>
-          <w:tcPr>
-            <w:tcW w:w="1458" w:type="dxa"/>
-            <w:vAlign w:val="center"/>
-          </w:tcPr>
-          <w:p>
-            <w:pPr>
-              <w:tabs>
-                <w:tab w:val="left" w:pos="360"/>
-              </w:tabs>
-              <w:jc w:val="right"/>
-              <w:rPr>
-                <w:rFonts w:ascii="Courier New" w:hAnsi="Courier New" w:cs="Courier New"/>
-                <w:sz w:val="20"/>
-                <w:szCs w:val="20"/>
-              </w:rPr>
-            </w:pPr>
-            <w:r>
-              <w:rPr>
-                <w:rFonts w:ascii="Courier New" w:hAnsi="Courier New" w:cs="Courier New"/>
-                <w:sz w:val="20"/>
-                <w:szCs w:val="20"/>
-              </w:rPr>
-              <w:t xml:space="preserve"> </w:t>
-            </w:r>
-            <w:r>
-              <w:rPr>
-                <w:rFonts w:ascii="Courier New" w:hAnsi="Courier New" w:cs="Courier New"/>
-                <w:sz w:val="20"/>
-                <w:szCs w:val="20"/>
-              </w:rPr>
-              <w:t>e</w:t>
-            </w:r>
-            <w:proofErr w:type="gramStart"/>
-            <w:r>
-              <w:rPr>
-                <w:rFonts w:ascii="Courier New" w:hAnsi="Courier New" w:cs="Courier New"/>
-                <w:sz w:val="20"/>
-                <w:szCs w:val="20"/>
-              </w:rPr>
-              <w:t>2.</w:t>
-            </w:r>
-            <w:r>
-              <w:rPr>
-                <w:rFonts w:ascii="Courier New" w:hAnsi="Courier New" w:cs="Courier New"/>
-                <w:sz w:val="20"/>
-                <w:szCs w:val="20"/>
-              </w:rPr>
-              <w:t>next</w:t>
-            </w:r>
-            <w:proofErr w:type="gramEnd"/>
-            <w:r>
-              <w:rPr>
-                <w:rFonts w:ascii="Courier New" w:hAnsi="Courier New" w:cs="Courier New"/>
-                <w:sz w:val="20"/>
-                <w:szCs w:val="20"/>
-              </w:rPr>
-              <w:t>:</w:t>
-            </w:r>
-          </w:p>
-        </w:tc>
-      </w:tr>
-    </w:tbl>
     <w:p>
       <w:pPr>
         <w:ind w:left="1440"/>
       </w:pPr>
+      <w:r>
+        <w:t>el.p:</w:t>
+      </w:r>
+      <w:r>
+        <w:t xml:space="preserve"> (size 8) -&gt; </w:t>
+      </w:r>
+      <w:r>
+        <w:rPr>
+          <w:highlight w:val="yellow"/>
+        </w:rPr>
+        <w:t>0</w:t>
+      </w:r>
     </w:p>
     <w:p>
       <w:pPr>
         <w:ind w:left="1440"/>
       </w:pPr>
       <w:r>
+        <w:t>el.y:</w:t>
+      </w:r>
+      <w:r>
+        <w:t xml:space="preserve"> (size 8) -&gt; </w:t>
+      </w:r>
+      <w:r>
+        <w:rPr>
+          <w:highlight w:val="yellow"/>
+        </w:rPr>
+        <w:t>8</w:t>
+      </w:r>
+    </w:p>
+    <w:p>
+      <w:pPr>
+        <w:ind w:left="1440"/>
+      </w:pPr>
+      <w:r>
+        <w:t>e2.x:</w:t>
+      </w:r>
+      <w:r>
+        <w:t xml:space="preserve"> (size 8) -&gt; </w:t>
+      </w:r>
+      <w:r>
+        <w:rPr>
+          <w:highlight w:val="yellow"/>
+        </w:rPr>
+        <w:t>0</w:t>
+      </w:r>
+    </w:p>
+    <w:p>
+      <w:pPr>
+        <w:ind w:left="1440"/>
+      </w:pPr>
+      <w:r>
+        <w:t>e2.next:</w:t>
+      </w:r>
+      <w:r>
+        <w:t xml:space="preserve"> (size 8) -&gt; </w:t>
+      </w:r>
+      <w:r>
+        <w:rPr>
+          <w:highlight w:val="yellow"/>
+        </w:rPr>
+        <w:t>8</w:t>
+      </w:r>
+    </w:p>
+    <w:p/>
+    <w:p>
+      <w:pPr>
+        <w:ind w:left="1440"/>
+      </w:pPr>
+      <w:r>
         <w:t xml:space="preserve">B.  </w:t>
       </w:r>
       <w:r>
@@ -2901,7 +2173,20 @@
       <w:pPr>
         <w:ind w:left="1440"/>
       </w:pPr>
-    </w:p>
+      <w:r>
+        <w:rPr>
+          <w:highlight w:val="yellow"/>
+        </w:rPr>
+        <w:t>16</w:t>
+      </w:r>
+      <w:r>
+        <w:rPr>
+          <w:highlight w:val="yellow"/>
+        </w:rPr>
+        <w:t xml:space="preserve"> bytes</w:t>
+      </w:r>
+    </w:p>
+    <w:p/>
     <w:p>
       <w:pPr>
         <w:ind w:left="1440"/>
@@ -2938,21 +2223,7 @@
         <w:rPr>
           <w:b/>
         </w:rPr>
-        <w:t xml:space="preserve">This assignment </w:t>
-      </w:r>
-      <w:proofErr w:type="gramStart"/>
-      <w:r>
-        <w:rPr>
-          <w:b/>
-        </w:rPr>
-        <w:t>continues on</w:t>
-      </w:r>
-      <w:proofErr w:type="gramEnd"/>
-      <w:r>
-        <w:rPr>
-          <w:b/>
-        </w:rPr>
-        <w:t xml:space="preserve"> the next page</w:t>
+        <w:t>This assignment continues on the next page</w:t>
       </w:r>
       <w:r>
         <w:rPr>
@@ -3012,25 +2283,7 @@
           <w:sz w:val="20"/>
           <w:szCs w:val="20"/>
         </w:rPr>
-        <w:t xml:space="preserve">    Note: Use </w:t>
-      </w:r>
-      <w:proofErr w:type="gramStart"/>
-      <w:r>
-        <w:rPr>
-          <w:rFonts w:ascii="Courier New" w:hAnsi="Courier New" w:cs="Courier New"/>
-          <w:sz w:val="20"/>
-          <w:szCs w:val="20"/>
-        </w:rPr>
-        <w:t>struct</w:t>
-      </w:r>
-      <w:proofErr w:type="gramEnd"/>
-      <w:r>
-        <w:rPr>
-          <w:rFonts w:ascii="Courier New" w:hAnsi="Courier New" w:cs="Courier New"/>
-          <w:sz w:val="20"/>
-          <w:szCs w:val="20"/>
-        </w:rPr>
-        <w:t xml:space="preserve"> P3 and P2 as given in this problem.</w:t>
+        <w:t xml:space="preserve">    Note: Use struct P3 and P2 as given in this problem.</w:t>
       </w:r>
     </w:p>
     <w:p>
@@ -3061,18 +2314,150 @@
           <w:sz w:val="20"/>
           <w:szCs w:val="20"/>
         </w:rPr>
-        <w:t xml:space="preserve">struct P1 </w:t>
-      </w:r>
-      <w:proofErr w:type="gramStart"/>
-      <w:r>
-        <w:rPr>
-          <w:rFonts w:ascii="Courier New" w:hAnsi="Courier New" w:cs="Courier New"/>
-          <w:sz w:val="20"/>
-          <w:szCs w:val="20"/>
-        </w:rPr>
-        <w:t>{ int</w:t>
-      </w:r>
-      <w:proofErr w:type="gramEnd"/>
+        <w:t>struct P1 { int i; char c; int j; char d; };</w:t>
+      </w:r>
+    </w:p>
+    <w:p>
+      <w:pPr>
+        <w:ind w:left="720"/>
+        <w:rPr>
+          <w:rFonts w:ascii="Courier New" w:hAnsi="Courier New" w:cs="Courier New"/>
+          <w:sz w:val="20"/>
+          <w:szCs w:val="20"/>
+        </w:rPr>
+      </w:pPr>
+      <w:r>
+        <w:rPr>
+          <w:rFonts w:ascii="Courier New" w:hAnsi="Courier New" w:cs="Courier New"/>
+          <w:sz w:val="20"/>
+          <w:szCs w:val="20"/>
+        </w:rPr>
+        <w:t xml:space="preserve">     </w:t>
+      </w:r>
+      <w:r>
+        <w:rPr>
+          <w:rFonts w:ascii="Courier New" w:hAnsi="Courier New" w:cs="Courier New"/>
+          <w:sz w:val="20"/>
+          <w:szCs w:val="20"/>
+        </w:rPr>
+        <w:t>Offsets</w:t>
+      </w:r>
+      <w:r>
+        <w:rPr>
+          <w:rFonts w:ascii="Courier New" w:hAnsi="Courier New" w:cs="Courier New"/>
+          <w:sz w:val="20"/>
+          <w:szCs w:val="20"/>
+        </w:rPr>
+        <w:t xml:space="preserve">:  </w:t>
+      </w:r>
+      <w:r>
+        <w:rPr>
+          <w:rFonts w:ascii="Courier New" w:hAnsi="Courier New" w:cs="Courier New"/>
+          <w:sz w:val="20"/>
+          <w:szCs w:val="20"/>
+          <w:highlight w:val="yellow"/>
+        </w:rPr>
+        <w:t>0</w:t>
+      </w:r>
+      <w:r>
+        <w:rPr>
+          <w:rFonts w:ascii="Courier New" w:hAnsi="Courier New" w:cs="Courier New"/>
+          <w:sz w:val="20"/>
+          <w:szCs w:val="20"/>
+        </w:rPr>
+        <w:t xml:space="preserve">   </w:t>
+      </w:r>
+      <w:r>
+        <w:rPr>
+          <w:rFonts w:ascii="Courier New" w:hAnsi="Courier New" w:cs="Courier New"/>
+          <w:sz w:val="20"/>
+          <w:szCs w:val="20"/>
+        </w:rPr>
+        <w:t xml:space="preserve">    </w:t>
+      </w:r>
+      <w:r>
+        <w:rPr>
+          <w:rFonts w:ascii="Courier New" w:hAnsi="Courier New" w:cs="Courier New"/>
+          <w:sz w:val="20"/>
+          <w:szCs w:val="20"/>
+          <w:highlight w:val="yellow"/>
+        </w:rPr>
+        <w:t>4</w:t>
+      </w:r>
+      <w:r>
+        <w:rPr>
+          <w:rFonts w:ascii="Courier New" w:hAnsi="Courier New" w:cs="Courier New"/>
+          <w:sz w:val="20"/>
+          <w:szCs w:val="20"/>
+        </w:rPr>
+        <w:t xml:space="preserve">   </w:t>
+      </w:r>
+      <w:r>
+        <w:rPr>
+          <w:rFonts w:ascii="Courier New" w:hAnsi="Courier New" w:cs="Courier New"/>
+          <w:sz w:val="20"/>
+          <w:szCs w:val="20"/>
+        </w:rPr>
+        <w:t xml:space="preserve">   </w:t>
+      </w:r>
+      <w:r>
+        <w:rPr>
+          <w:rFonts w:ascii="Courier New" w:hAnsi="Courier New" w:cs="Courier New"/>
+          <w:sz w:val="20"/>
+          <w:szCs w:val="20"/>
+          <w:highlight w:val="yellow"/>
+        </w:rPr>
+        <w:t>8</w:t>
+      </w:r>
+      <w:r>
+        <w:rPr>
+          <w:rFonts w:ascii="Courier New" w:hAnsi="Courier New" w:cs="Courier New"/>
+          <w:sz w:val="20"/>
+          <w:szCs w:val="20"/>
+        </w:rPr>
+        <w:t xml:space="preserve">   </w:t>
+      </w:r>
+      <w:r>
+        <w:rPr>
+          <w:rFonts w:ascii="Courier New" w:hAnsi="Courier New" w:cs="Courier New"/>
+          <w:sz w:val="20"/>
+          <w:szCs w:val="20"/>
+        </w:rPr>
+        <w:t xml:space="preserve">    </w:t>
+      </w:r>
+      <w:r>
+        <w:rPr>
+          <w:rFonts w:ascii="Courier New" w:hAnsi="Courier New" w:cs="Courier New"/>
+          <w:sz w:val="20"/>
+          <w:szCs w:val="20"/>
+          <w:highlight w:val="yellow"/>
+        </w:rPr>
+        <w:t>12</w:t>
+      </w:r>
+      <w:r>
+        <w:rPr>
+          <w:rFonts w:ascii="Courier New" w:hAnsi="Courier New" w:cs="Courier New"/>
+          <w:sz w:val="20"/>
+          <w:szCs w:val="20"/>
+        </w:rPr>
+        <w:t xml:space="preserve">  </w:t>
+      </w:r>
+      <w:r>
+        <w:rPr>
+          <w:rFonts w:ascii="Courier New" w:hAnsi="Courier New" w:cs="Courier New"/>
+          <w:sz w:val="20"/>
+          <w:szCs w:val="20"/>
+        </w:rPr>
+        <w:t xml:space="preserve">     </w:t>
+      </w:r>
+      <w:r>
+        <w:rPr>
+          <w:rFonts w:ascii="Courier New" w:hAnsi="Courier New" w:cs="Courier New"/>
+          <w:sz w:val="20"/>
+          <w:szCs w:val="20"/>
+        </w:rPr>
+        <w:t>Size:</w:t>
+      </w:r>
       <w:r>
         <w:rPr>
           <w:rFonts w:ascii="Courier New" w:hAnsi="Courier New" w:cs="Courier New"/>
@@ -3081,41 +2466,91 @@
         </w:rPr>
         <w:t xml:space="preserve"> </w:t>
       </w:r>
-      <w:proofErr w:type="spellStart"/>
-      <w:r>
-        <w:rPr>
-          <w:rFonts w:ascii="Courier New" w:hAnsi="Courier New" w:cs="Courier New"/>
-          <w:sz w:val="20"/>
-          <w:szCs w:val="20"/>
-        </w:rPr>
-        <w:t>i</w:t>
-      </w:r>
-      <w:proofErr w:type="spellEnd"/>
-      <w:r>
-        <w:rPr>
-          <w:rFonts w:ascii="Courier New" w:hAnsi="Courier New" w:cs="Courier New"/>
-          <w:sz w:val="20"/>
-          <w:szCs w:val="20"/>
-        </w:rPr>
-        <w:t>; char c; int j; char d</w:t>
-      </w:r>
-      <w:proofErr w:type="gramStart"/>
-      <w:r>
-        <w:rPr>
-          <w:rFonts w:ascii="Courier New" w:hAnsi="Courier New" w:cs="Courier New"/>
-          <w:sz w:val="20"/>
-          <w:szCs w:val="20"/>
-        </w:rPr>
-        <w:t>; }</w:t>
-      </w:r>
-      <w:proofErr w:type="gramEnd"/>
-      <w:r>
-        <w:rPr>
-          <w:rFonts w:ascii="Courier New" w:hAnsi="Courier New" w:cs="Courier New"/>
-          <w:sz w:val="20"/>
-          <w:szCs w:val="20"/>
-        </w:rPr>
-        <w:t>;</w:t>
+      <w:r>
+        <w:rPr>
+          <w:rFonts w:ascii="Courier New" w:hAnsi="Courier New" w:cs="Courier New"/>
+          <w:sz w:val="20"/>
+          <w:szCs w:val="20"/>
+          <w:highlight w:val="yellow"/>
+        </w:rPr>
+        <w:t>16</w:t>
+      </w:r>
+      <w:r>
+        <w:rPr>
+          <w:rFonts w:ascii="Courier New" w:hAnsi="Courier New" w:cs="Courier New"/>
+          <w:sz w:val="20"/>
+          <w:szCs w:val="20"/>
+        </w:rPr>
+        <w:t xml:space="preserve">   </w:t>
+      </w:r>
+      <w:r>
+        <w:rPr>
+          <w:rFonts w:ascii="Courier New" w:hAnsi="Courier New" w:cs="Courier New"/>
+          <w:sz w:val="20"/>
+          <w:szCs w:val="20"/>
+        </w:rPr>
+        <w:t xml:space="preserve">  Alignment: </w:t>
+      </w:r>
+      <w:r>
+        <w:rPr>
+          <w:rFonts w:ascii="Courier New" w:hAnsi="Courier New" w:cs="Courier New"/>
+          <w:sz w:val="20"/>
+          <w:szCs w:val="20"/>
+          <w:highlight w:val="yellow"/>
+        </w:rPr>
+        <w:t>4</w:t>
+      </w:r>
+    </w:p>
+    <w:p>
+      <w:pPr>
+        <w:ind w:left="720"/>
+        <w:rPr>
+          <w:rFonts w:ascii="Courier New" w:hAnsi="Courier New" w:cs="Courier New"/>
+          <w:sz w:val="20"/>
+          <w:szCs w:val="20"/>
+        </w:rPr>
+      </w:pPr>
+    </w:p>
+    <w:p>
+      <w:pPr>
+        <w:ind w:left="720"/>
+        <w:rPr>
+          <w:rFonts w:ascii="Courier New" w:hAnsi="Courier New" w:cs="Courier New"/>
+          <w:sz w:val="20"/>
+          <w:szCs w:val="20"/>
+        </w:rPr>
+      </w:pPr>
+      <w:r>
+        <w:rPr>
+          <w:rFonts w:ascii="Courier New" w:hAnsi="Courier New" w:cs="Courier New"/>
+          <w:sz w:val="20"/>
+          <w:szCs w:val="20"/>
+        </w:rPr>
+        <w:t xml:space="preserve">B. </w:t>
+      </w:r>
+      <w:r>
+        <w:rPr>
+          <w:rFonts w:ascii="Courier New" w:hAnsi="Courier New" w:cs="Courier New"/>
+          <w:sz w:val="20"/>
+          <w:szCs w:val="20"/>
+        </w:rPr>
+        <w:t>struct P2 { int i; ch</w:t>
+      </w:r>
+      <w:r>
+        <w:rPr>
+          <w:rFonts w:ascii="Courier New" w:hAnsi="Courier New" w:cs="Courier New"/>
+          <w:sz w:val="20"/>
+          <w:szCs w:val="20"/>
+        </w:rPr>
+        <w:t>ar c; char d; long</w:t>
+      </w:r>
+      <w:r>
+        <w:rPr>
+          <w:rFonts w:ascii="Courier New" w:hAnsi="Courier New" w:cs="Courier New"/>
+          <w:sz w:val="20"/>
+          <w:szCs w:val="20"/>
+        </w:rPr>
+        <w:t xml:space="preserve"> j; };</w:t>
       </w:r>
     </w:p>
     <w:p>
@@ -3141,108 +2576,100 @@
           <w:sz w:val="20"/>
           <w:szCs w:val="20"/>
         </w:rPr>
-        <w:t>Offsets</w:t>
-      </w:r>
-      <w:proofErr w:type="gramStart"/>
-      <w:r>
-        <w:rPr>
-          <w:rFonts w:ascii="Courier New" w:hAnsi="Courier New" w:cs="Courier New"/>
-          <w:sz w:val="20"/>
-          <w:szCs w:val="20"/>
-        </w:rPr>
-        <w:t xml:space="preserve">:  ____    </w:t>
-      </w:r>
-      <w:proofErr w:type="gramEnd"/>
-      <w:r>
-        <w:rPr>
-          <w:rFonts w:ascii="Courier New" w:hAnsi="Courier New" w:cs="Courier New"/>
-          <w:sz w:val="20"/>
-          <w:szCs w:val="20"/>
-        </w:rPr>
-        <w:t xml:space="preserve">____   ____    ____     </w:t>
-      </w:r>
-      <w:proofErr w:type="gramStart"/>
-      <w:r>
-        <w:rPr>
-          <w:rFonts w:ascii="Courier New" w:hAnsi="Courier New" w:cs="Courier New"/>
-          <w:sz w:val="20"/>
-          <w:szCs w:val="20"/>
-        </w:rPr>
-        <w:t>Size:_</w:t>
-      </w:r>
-      <w:proofErr w:type="gramEnd"/>
-      <w:r>
-        <w:rPr>
-          <w:rFonts w:ascii="Courier New" w:hAnsi="Courier New" w:cs="Courier New"/>
-          <w:sz w:val="20"/>
-          <w:szCs w:val="20"/>
-        </w:rPr>
-        <w:t>____</w:t>
-      </w:r>
-      <w:proofErr w:type="gramStart"/>
-      <w:r>
-        <w:rPr>
-          <w:rFonts w:ascii="Courier New" w:hAnsi="Courier New" w:cs="Courier New"/>
-          <w:sz w:val="20"/>
-          <w:szCs w:val="20"/>
-        </w:rPr>
-        <w:t>_  Alignment</w:t>
-      </w:r>
-      <w:proofErr w:type="gramEnd"/>
-      <w:r>
-        <w:rPr>
-          <w:rFonts w:ascii="Courier New" w:hAnsi="Courier New" w:cs="Courier New"/>
-          <w:sz w:val="20"/>
-          <w:szCs w:val="20"/>
-        </w:rPr>
-        <w:t>: ______</w:t>
-      </w:r>
-    </w:p>
-    <w:p>
-      <w:pPr>
-        <w:ind w:left="720"/>
-        <w:rPr>
-          <w:rFonts w:ascii="Courier New" w:hAnsi="Courier New" w:cs="Courier New"/>
-          <w:sz w:val="20"/>
-          <w:szCs w:val="20"/>
-        </w:rPr>
-      </w:pPr>
-    </w:p>
-    <w:p>
-      <w:pPr>
-        <w:ind w:left="720"/>
-        <w:rPr>
-          <w:rFonts w:ascii="Courier New" w:hAnsi="Courier New" w:cs="Courier New"/>
-          <w:sz w:val="20"/>
-          <w:szCs w:val="20"/>
-        </w:rPr>
-      </w:pPr>
-      <w:r>
-        <w:rPr>
-          <w:rFonts w:ascii="Courier New" w:hAnsi="Courier New" w:cs="Courier New"/>
-          <w:sz w:val="20"/>
-          <w:szCs w:val="20"/>
-        </w:rPr>
-        <w:t xml:space="preserve">B. </w:t>
-      </w:r>
-      <w:r>
-        <w:rPr>
-          <w:rFonts w:ascii="Courier New" w:hAnsi="Courier New" w:cs="Courier New"/>
-          <w:sz w:val="20"/>
-          <w:szCs w:val="20"/>
-        </w:rPr>
-        <w:t xml:space="preserve">struct P2 </w:t>
-      </w:r>
-      <w:proofErr w:type="gramStart"/>
-      <w:r>
-        <w:rPr>
-          <w:rFonts w:ascii="Courier New" w:hAnsi="Courier New" w:cs="Courier New"/>
-          <w:sz w:val="20"/>
-          <w:szCs w:val="20"/>
-        </w:rPr>
-        <w:t>{ int</w:t>
-      </w:r>
-      <w:proofErr w:type="gramEnd"/>
+        <w:t>Offset</w:t>
+      </w:r>
+      <w:r>
+        <w:rPr>
+          <w:rFonts w:ascii="Courier New" w:hAnsi="Courier New" w:cs="Courier New"/>
+          <w:sz w:val="20"/>
+          <w:szCs w:val="20"/>
+        </w:rPr>
+        <w:t xml:space="preserve">s:  </w:t>
+      </w:r>
+      <w:r>
+        <w:rPr>
+          <w:rFonts w:ascii="Courier New" w:hAnsi="Courier New" w:cs="Courier New"/>
+          <w:sz w:val="20"/>
+          <w:szCs w:val="20"/>
+          <w:highlight w:val="yellow"/>
+        </w:rPr>
+        <w:t>0</w:t>
+      </w:r>
+      <w:r>
+        <w:rPr>
+          <w:rFonts w:ascii="Courier New" w:hAnsi="Courier New" w:cs="Courier New"/>
+          <w:sz w:val="20"/>
+          <w:szCs w:val="20"/>
+        </w:rPr>
+        <w:t xml:space="preserve">   </w:t>
+      </w:r>
+      <w:r>
+        <w:rPr>
+          <w:rFonts w:ascii="Courier New" w:hAnsi="Courier New" w:cs="Courier New"/>
+          <w:sz w:val="20"/>
+          <w:szCs w:val="20"/>
+        </w:rPr>
+        <w:t xml:space="preserve">    </w:t>
+      </w:r>
+      <w:r>
+        <w:rPr>
+          <w:rFonts w:ascii="Courier New" w:hAnsi="Courier New" w:cs="Courier New"/>
+          <w:sz w:val="20"/>
+          <w:szCs w:val="20"/>
+          <w:highlight w:val="yellow"/>
+        </w:rPr>
+        <w:t>4</w:t>
+      </w:r>
+      <w:r>
+        <w:rPr>
+          <w:rFonts w:ascii="Courier New" w:hAnsi="Courier New" w:cs="Courier New"/>
+          <w:sz w:val="20"/>
+          <w:szCs w:val="20"/>
+        </w:rPr>
+        <w:t xml:space="preserve">   </w:t>
+      </w:r>
+      <w:r>
+        <w:rPr>
+          <w:rFonts w:ascii="Courier New" w:hAnsi="Courier New" w:cs="Courier New"/>
+          <w:sz w:val="20"/>
+          <w:szCs w:val="20"/>
+        </w:rPr>
+        <w:t xml:space="preserve">    </w:t>
+      </w:r>
+      <w:r>
+        <w:rPr>
+          <w:rFonts w:ascii="Courier New" w:hAnsi="Courier New" w:cs="Courier New"/>
+          <w:sz w:val="20"/>
+          <w:szCs w:val="20"/>
+          <w:highlight w:val="yellow"/>
+        </w:rPr>
+        <w:t>5</w:t>
+      </w:r>
+      <w:r>
+        <w:rPr>
+          <w:rFonts w:ascii="Courier New" w:hAnsi="Courier New" w:cs="Courier New"/>
+          <w:sz w:val="20"/>
+          <w:szCs w:val="20"/>
+        </w:rPr>
+        <w:t xml:space="preserve">   </w:t>
+      </w:r>
+      <w:r>
+        <w:rPr>
+          <w:rFonts w:ascii="Courier New" w:hAnsi="Courier New" w:cs="Courier New"/>
+          <w:sz w:val="20"/>
+          <w:szCs w:val="20"/>
+        </w:rPr>
+        <w:t xml:space="preserve">   </w:t>
+      </w:r>
+      <w:r>
+        <w:rPr>
+          <w:rFonts w:ascii="Courier New" w:hAnsi="Courier New" w:cs="Courier New"/>
+          <w:sz w:val="20"/>
+          <w:szCs w:val="20"/>
+          <w:highlight w:val="yellow"/>
+        </w:rPr>
+        <w:t>8</w:t>
+      </w:r>
       <w:r>
         <w:rPr>
           <w:rFonts w:ascii="Courier New" w:hAnsi="Courier New" w:cs="Courier New"/>
@@ -3251,68 +2678,14 @@
         </w:rPr>
         <w:t xml:space="preserve"> </w:t>
       </w:r>
-      <w:proofErr w:type="spellStart"/>
-      <w:r>
-        <w:rPr>
-          <w:rFonts w:ascii="Courier New" w:hAnsi="Courier New" w:cs="Courier New"/>
-          <w:sz w:val="20"/>
-          <w:szCs w:val="20"/>
-        </w:rPr>
-        <w:t>i</w:t>
-      </w:r>
-      <w:proofErr w:type="spellEnd"/>
-      <w:r>
-        <w:rPr>
-          <w:rFonts w:ascii="Courier New" w:hAnsi="Courier New" w:cs="Courier New"/>
-          <w:sz w:val="20"/>
-          <w:szCs w:val="20"/>
-        </w:rPr>
-        <w:t>; ch</w:t>
-      </w:r>
-      <w:r>
-        <w:rPr>
-          <w:rFonts w:ascii="Courier New" w:hAnsi="Courier New" w:cs="Courier New"/>
-          <w:sz w:val="20"/>
-          <w:szCs w:val="20"/>
-        </w:rPr>
-        <w:t>ar c; char d; long</w:t>
-      </w:r>
-      <w:r>
-        <w:rPr>
-          <w:rFonts w:ascii="Courier New" w:hAnsi="Courier New" w:cs="Courier New"/>
-          <w:sz w:val="20"/>
-          <w:szCs w:val="20"/>
-        </w:rPr>
-        <w:t xml:space="preserve"> j</w:t>
-      </w:r>
-      <w:proofErr w:type="gramStart"/>
-      <w:r>
-        <w:rPr>
-          <w:rFonts w:ascii="Courier New" w:hAnsi="Courier New" w:cs="Courier New"/>
-          <w:sz w:val="20"/>
-          <w:szCs w:val="20"/>
-        </w:rPr>
-        <w:t>; }</w:t>
-      </w:r>
-      <w:proofErr w:type="gramEnd"/>
-      <w:r>
-        <w:rPr>
-          <w:rFonts w:ascii="Courier New" w:hAnsi="Courier New" w:cs="Courier New"/>
-          <w:sz w:val="20"/>
-          <w:szCs w:val="20"/>
-        </w:rPr>
-        <w:t>;</w:t>
-      </w:r>
-    </w:p>
-    <w:p>
-      <w:pPr>
-        <w:ind w:left="720"/>
-        <w:rPr>
-          <w:rFonts w:ascii="Courier New" w:hAnsi="Courier New" w:cs="Courier New"/>
-          <w:sz w:val="20"/>
-          <w:szCs w:val="20"/>
-        </w:rPr>
-      </w:pPr>
+      <w:r>
+        <w:rPr>
+          <w:rFonts w:ascii="Courier New" w:hAnsi="Courier New" w:cs="Courier New"/>
+          <w:sz w:val="20"/>
+          <w:szCs w:val="20"/>
+        </w:rPr>
+        <w:t xml:space="preserve">  </w:t>
+      </w:r>
       <w:r>
         <w:rPr>
           <w:rFonts w:ascii="Courier New" w:hAnsi="Courier New" w:cs="Courier New"/>
@@ -3327,69 +2700,49 @@
           <w:sz w:val="20"/>
           <w:szCs w:val="20"/>
         </w:rPr>
-        <w:t>Offset</w:t>
-      </w:r>
-      <w:r>
-        <w:rPr>
-          <w:rFonts w:ascii="Courier New" w:hAnsi="Courier New" w:cs="Courier New"/>
-          <w:sz w:val="20"/>
-          <w:szCs w:val="20"/>
-        </w:rPr>
-        <w:t>s</w:t>
-      </w:r>
-      <w:proofErr w:type="gramStart"/>
-      <w:r>
-        <w:rPr>
-          <w:rFonts w:ascii="Courier New" w:hAnsi="Courier New" w:cs="Courier New"/>
-          <w:sz w:val="20"/>
-          <w:szCs w:val="20"/>
-        </w:rPr>
-        <w:t xml:space="preserve">:  ____    </w:t>
-      </w:r>
-      <w:proofErr w:type="gramEnd"/>
-      <w:r>
-        <w:rPr>
-          <w:rFonts w:ascii="Courier New" w:hAnsi="Courier New" w:cs="Courier New"/>
-          <w:sz w:val="20"/>
-          <w:szCs w:val="20"/>
-        </w:rPr>
-        <w:t xml:space="preserve">____    ____   ____     </w:t>
-      </w:r>
-      <w:proofErr w:type="gramStart"/>
-      <w:r>
-        <w:rPr>
-          <w:rFonts w:ascii="Courier New" w:hAnsi="Courier New" w:cs="Courier New"/>
-          <w:sz w:val="20"/>
-          <w:szCs w:val="20"/>
-        </w:rPr>
-        <w:t>Size:_</w:t>
-      </w:r>
-      <w:proofErr w:type="gramEnd"/>
-      <w:r>
-        <w:rPr>
-          <w:rFonts w:ascii="Courier New" w:hAnsi="Courier New" w:cs="Courier New"/>
-          <w:sz w:val="20"/>
-          <w:szCs w:val="20"/>
-        </w:rPr>
-        <w:t>____</w:t>
-      </w:r>
-      <w:proofErr w:type="gramStart"/>
-      <w:r>
-        <w:rPr>
-          <w:rFonts w:ascii="Courier New" w:hAnsi="Courier New" w:cs="Courier New"/>
-          <w:sz w:val="20"/>
-          <w:szCs w:val="20"/>
-        </w:rPr>
-        <w:t>_  Alignment</w:t>
-      </w:r>
-      <w:proofErr w:type="gramEnd"/>
-      <w:r>
-        <w:rPr>
-          <w:rFonts w:ascii="Courier New" w:hAnsi="Courier New" w:cs="Courier New"/>
-          <w:sz w:val="20"/>
-          <w:szCs w:val="20"/>
-        </w:rPr>
-        <w:t>: ______</w:t>
+        <w:t>Size:</w:t>
+      </w:r>
+      <w:r>
+        <w:rPr>
+          <w:rFonts w:ascii="Courier New" w:hAnsi="Courier New" w:cs="Courier New"/>
+          <w:sz w:val="20"/>
+          <w:szCs w:val="20"/>
+        </w:rPr>
+        <w:t xml:space="preserve"> </w:t>
+      </w:r>
+      <w:r>
+        <w:rPr>
+          <w:rFonts w:ascii="Courier New" w:hAnsi="Courier New" w:cs="Courier New"/>
+          <w:sz w:val="20"/>
+          <w:szCs w:val="20"/>
+          <w:highlight w:val="yellow"/>
+        </w:rPr>
+        <w:t>16</w:t>
+      </w:r>
+      <w:r>
+        <w:rPr>
+          <w:rFonts w:ascii="Courier New" w:hAnsi="Courier New" w:cs="Courier New"/>
+          <w:sz w:val="20"/>
+          <w:szCs w:val="20"/>
+        </w:rPr>
+        <w:t xml:space="preserve">    </w:t>
+      </w:r>
+      <w:r>
+        <w:rPr>
+          <w:rFonts w:ascii="Courier New" w:hAnsi="Courier New" w:cs="Courier New"/>
+          <w:sz w:val="20"/>
+          <w:szCs w:val="20"/>
+        </w:rPr>
+        <w:t xml:space="preserve"> Alignment: </w:t>
+      </w:r>
+      <w:r>
+        <w:rPr>
+          <w:rFonts w:ascii="Courier New" w:hAnsi="Courier New" w:cs="Courier New"/>
+          <w:sz w:val="20"/>
+          <w:szCs w:val="20"/>
+          <w:highlight w:val="yellow"/>
+        </w:rPr>
+        <w:t>8</w:t>
       </w:r>
     </w:p>
     <w:p>
@@ -3425,18 +2778,93 @@
           <w:sz w:val="20"/>
           <w:szCs w:val="20"/>
         </w:rPr>
-        <w:t xml:space="preserve">struct P3 </w:t>
-      </w:r>
-      <w:proofErr w:type="gramStart"/>
-      <w:r>
-        <w:rPr>
-          <w:rFonts w:ascii="Courier New" w:hAnsi="Courier New" w:cs="Courier New"/>
-          <w:sz w:val="20"/>
-          <w:szCs w:val="20"/>
-        </w:rPr>
-        <w:t>{ short</w:t>
-      </w:r>
-      <w:proofErr w:type="gramEnd"/>
+        <w:t>struct P3 { short w[3]; char c[3] };</w:t>
+      </w:r>
+    </w:p>
+    <w:p>
+      <w:pPr>
+        <w:ind w:left="720"/>
+        <w:rPr>
+          <w:rFonts w:ascii="Courier New" w:hAnsi="Courier New" w:cs="Courier New"/>
+          <w:sz w:val="20"/>
+          <w:szCs w:val="20"/>
+        </w:rPr>
+      </w:pPr>
+      <w:r>
+        <w:rPr>
+          <w:rFonts w:ascii="Courier New" w:hAnsi="Courier New" w:cs="Courier New"/>
+          <w:sz w:val="20"/>
+          <w:szCs w:val="20"/>
+        </w:rPr>
+        <w:t xml:space="preserve">     Offsets:   </w:t>
+      </w:r>
+      <w:r>
+        <w:rPr>
+          <w:rFonts w:ascii="Courier New" w:hAnsi="Courier New" w:cs="Courier New"/>
+          <w:sz w:val="20"/>
+          <w:szCs w:val="20"/>
+          <w:highlight w:val="yellow"/>
+        </w:rPr>
+        <w:t>0</w:t>
+      </w:r>
+      <w:r>
+        <w:rPr>
+          <w:rFonts w:ascii="Courier New" w:hAnsi="Courier New" w:cs="Courier New"/>
+          <w:sz w:val="20"/>
+          <w:szCs w:val="20"/>
+        </w:rPr>
+        <w:t xml:space="preserve">    </w:t>
+      </w:r>
+      <w:r>
+        <w:rPr>
+          <w:rFonts w:ascii="Courier New" w:hAnsi="Courier New" w:cs="Courier New"/>
+          <w:sz w:val="20"/>
+          <w:szCs w:val="20"/>
+        </w:rPr>
+        <w:t xml:space="preserve">        </w:t>
+      </w:r>
+      <w:r>
+        <w:rPr>
+          <w:rFonts w:ascii="Courier New" w:hAnsi="Courier New" w:cs="Courier New"/>
+          <w:sz w:val="20"/>
+          <w:szCs w:val="20"/>
+          <w:highlight w:val="yellow"/>
+        </w:rPr>
+        <w:t>6</w:t>
+      </w:r>
+      <w:r>
+        <w:rPr>
+          <w:rFonts w:ascii="Courier New" w:hAnsi="Courier New" w:cs="Courier New"/>
+          <w:sz w:val="20"/>
+          <w:szCs w:val="20"/>
+        </w:rPr>
+        <w:t xml:space="preserve">      </w:t>
+      </w:r>
+      <w:r>
+        <w:rPr>
+          <w:rFonts w:ascii="Courier New" w:hAnsi="Courier New" w:cs="Courier New"/>
+          <w:sz w:val="20"/>
+          <w:szCs w:val="20"/>
+        </w:rPr>
+        <w:t xml:space="preserve">   </w:t>
+      </w:r>
+      <w:r>
+        <w:rPr>
+          <w:rFonts w:ascii="Courier New" w:hAnsi="Courier New" w:cs="Courier New"/>
+          <w:sz w:val="20"/>
+          <w:szCs w:val="20"/>
+        </w:rPr>
+        <w:tab/>
+        <w:t xml:space="preserve">     </w:t>
+      </w:r>
+      <w:r>
+        <w:rPr>
+          <w:rFonts w:ascii="Courier New" w:hAnsi="Courier New" w:cs="Courier New"/>
+          <w:sz w:val="20"/>
+          <w:szCs w:val="20"/>
+        </w:rPr>
+        <w:t>Size:</w:t>
+      </w:r>
       <w:r>
         <w:rPr>
           <w:rFonts w:ascii="Courier New" w:hAnsi="Courier New" w:cs="Courier New"/>
@@ -3445,167 +2873,265 @@
         </w:rPr>
         <w:t xml:space="preserve"> </w:t>
       </w:r>
-      <w:proofErr w:type="gramStart"/>
-      <w:r>
-        <w:rPr>
-          <w:rFonts w:ascii="Courier New" w:hAnsi="Courier New" w:cs="Courier New"/>
-          <w:sz w:val="20"/>
-          <w:szCs w:val="20"/>
-        </w:rPr>
-        <w:t>w[</w:t>
-      </w:r>
-      <w:proofErr w:type="gramEnd"/>
-      <w:r>
-        <w:rPr>
-          <w:rFonts w:ascii="Courier New" w:hAnsi="Courier New" w:cs="Courier New"/>
-          <w:sz w:val="20"/>
-          <w:szCs w:val="20"/>
-        </w:rPr>
-        <w:t xml:space="preserve">3]; char </w:t>
-      </w:r>
-      <w:proofErr w:type="gramStart"/>
-      <w:r>
-        <w:rPr>
-          <w:rFonts w:ascii="Courier New" w:hAnsi="Courier New" w:cs="Courier New"/>
-          <w:sz w:val="20"/>
-          <w:szCs w:val="20"/>
-        </w:rPr>
-        <w:t>c[</w:t>
-      </w:r>
-      <w:proofErr w:type="gramEnd"/>
-      <w:r>
-        <w:rPr>
-          <w:rFonts w:ascii="Courier New" w:hAnsi="Courier New" w:cs="Courier New"/>
-          <w:sz w:val="20"/>
-          <w:szCs w:val="20"/>
-        </w:rPr>
-        <w:t>3</w:t>
-      </w:r>
-      <w:proofErr w:type="gramStart"/>
-      <w:r>
-        <w:rPr>
-          <w:rFonts w:ascii="Courier New" w:hAnsi="Courier New" w:cs="Courier New"/>
-          <w:sz w:val="20"/>
-          <w:szCs w:val="20"/>
-        </w:rPr>
-        <w:t>] }</w:t>
-      </w:r>
-      <w:proofErr w:type="gramEnd"/>
-      <w:r>
-        <w:rPr>
-          <w:rFonts w:ascii="Courier New" w:hAnsi="Courier New" w:cs="Courier New"/>
-          <w:sz w:val="20"/>
-          <w:szCs w:val="20"/>
-        </w:rPr>
-        <w:t>;</w:t>
-      </w:r>
-    </w:p>
-    <w:p>
-      <w:pPr>
-        <w:ind w:left="720"/>
-        <w:rPr>
-          <w:rFonts w:ascii="Courier New" w:hAnsi="Courier New" w:cs="Courier New"/>
-          <w:sz w:val="20"/>
-          <w:szCs w:val="20"/>
-        </w:rPr>
-      </w:pPr>
-      <w:r>
-        <w:rPr>
-          <w:rFonts w:ascii="Courier New" w:hAnsi="Courier New" w:cs="Courier New"/>
-          <w:sz w:val="20"/>
-          <w:szCs w:val="20"/>
-        </w:rPr>
-        <w:t xml:space="preserve">     Offsets:   _____        ____   </w:t>
-      </w:r>
-      <w:r>
-        <w:rPr>
-          <w:rFonts w:ascii="Courier New" w:hAnsi="Courier New" w:cs="Courier New"/>
-          <w:sz w:val="20"/>
-          <w:szCs w:val="20"/>
-        </w:rPr>
-        <w:tab/>
+      <w:r>
+        <w:rPr>
+          <w:rFonts w:ascii="Courier New" w:hAnsi="Courier New" w:cs="Courier New"/>
+          <w:sz w:val="20"/>
+          <w:szCs w:val="20"/>
+          <w:highlight w:val="yellow"/>
+        </w:rPr>
+        <w:t>10</w:t>
+      </w:r>
+      <w:r>
+        <w:rPr>
+          <w:rFonts w:ascii="Courier New" w:hAnsi="Courier New" w:cs="Courier New"/>
+          <w:sz w:val="20"/>
+          <w:szCs w:val="20"/>
+        </w:rPr>
+        <w:t xml:space="preserve">  </w:t>
+      </w:r>
+      <w:r>
+        <w:rPr>
+          <w:rFonts w:ascii="Courier New" w:hAnsi="Courier New" w:cs="Courier New"/>
+          <w:sz w:val="20"/>
+          <w:szCs w:val="20"/>
+        </w:rPr>
+        <w:t xml:space="preserve"> </w:t>
+      </w:r>
+      <w:r>
+        <w:rPr>
+          <w:rFonts w:ascii="Courier New" w:hAnsi="Courier New" w:cs="Courier New"/>
+          <w:sz w:val="20"/>
+          <w:szCs w:val="20"/>
+        </w:rPr>
+        <w:t xml:space="preserve">  </w:t>
+      </w:r>
+      <w:r>
+        <w:rPr>
+          <w:rFonts w:ascii="Courier New" w:hAnsi="Courier New" w:cs="Courier New"/>
+          <w:sz w:val="20"/>
+          <w:szCs w:val="20"/>
+        </w:rPr>
+        <w:t xml:space="preserve">Alignment: </w:t>
+      </w:r>
+      <w:r>
+        <w:rPr>
+          <w:rFonts w:ascii="Courier New" w:hAnsi="Courier New" w:cs="Courier New"/>
+          <w:sz w:val="20"/>
+          <w:szCs w:val="20"/>
+          <w:highlight w:val="yellow"/>
+        </w:rPr>
+        <w:t>2</w:t>
+      </w:r>
+    </w:p>
+    <w:p>
+      <w:pPr>
+        <w:ind w:left="720"/>
+        <w:rPr>
+          <w:rFonts w:ascii="Courier New" w:hAnsi="Courier New" w:cs="Courier New"/>
+          <w:sz w:val="20"/>
+          <w:szCs w:val="20"/>
+        </w:rPr>
+      </w:pPr>
+    </w:p>
+    <w:p>
+      <w:pPr>
+        <w:ind w:left="720"/>
+        <w:rPr>
+          <w:rFonts w:ascii="Courier New" w:hAnsi="Courier New" w:cs="Courier New"/>
+          <w:sz w:val="20"/>
+          <w:szCs w:val="20"/>
+        </w:rPr>
+      </w:pPr>
+      <w:r>
+        <w:rPr>
+          <w:rFonts w:ascii="Courier New" w:hAnsi="Courier New" w:cs="Courier New"/>
+          <w:sz w:val="20"/>
+          <w:szCs w:val="20"/>
+        </w:rPr>
+        <w:t xml:space="preserve">D. </w:t>
+      </w:r>
+      <w:r>
+        <w:rPr>
+          <w:rFonts w:ascii="Courier New" w:hAnsi="Courier New" w:cs="Courier New"/>
+          <w:sz w:val="20"/>
+          <w:szCs w:val="20"/>
+        </w:rPr>
+        <w:t>struct P4 {</w:t>
+      </w:r>
+      <w:r>
+        <w:rPr>
+          <w:rFonts w:ascii="Courier New" w:hAnsi="Courier New" w:cs="Courier New"/>
+          <w:sz w:val="20"/>
+          <w:szCs w:val="20"/>
+        </w:rPr>
+        <w:t xml:space="preserve"> </w:t>
+      </w:r>
+      <w:r>
+        <w:rPr>
+          <w:rFonts w:ascii="Courier New" w:hAnsi="Courier New" w:cs="Courier New"/>
+          <w:sz w:val="20"/>
+          <w:szCs w:val="20"/>
+        </w:rPr>
+        <w:t>shor</w:t>
+      </w:r>
+      <w:r>
+        <w:rPr>
+          <w:rFonts w:ascii="Courier New" w:hAnsi="Courier New" w:cs="Courier New"/>
+          <w:sz w:val="20"/>
+          <w:szCs w:val="20"/>
+        </w:rPr>
+        <w:t>t w[5</w:t>
+      </w:r>
+      <w:r>
+        <w:rPr>
+          <w:rFonts w:ascii="Courier New" w:hAnsi="Courier New" w:cs="Courier New"/>
+          <w:sz w:val="20"/>
+          <w:szCs w:val="20"/>
+        </w:rPr>
+        <w:t>]; char *c[3] };</w:t>
+      </w:r>
+    </w:p>
+    <w:p>
+      <w:pPr>
+        <w:ind w:left="720"/>
+        <w:rPr>
+          <w:rFonts w:ascii="Courier New" w:hAnsi="Courier New" w:cs="Courier New"/>
+          <w:sz w:val="20"/>
+          <w:szCs w:val="20"/>
+        </w:rPr>
+      </w:pPr>
+      <w:r>
+        <w:rPr>
+          <w:rFonts w:ascii="Courier New" w:hAnsi="Courier New" w:cs="Courier New"/>
+          <w:sz w:val="20"/>
+          <w:szCs w:val="20"/>
+        </w:rPr>
         <w:t xml:space="preserve">     </w:t>
       </w:r>
-      <w:proofErr w:type="gramStart"/>
-      <w:r>
-        <w:rPr>
-          <w:rFonts w:ascii="Courier New" w:hAnsi="Courier New" w:cs="Courier New"/>
-          <w:sz w:val="20"/>
-          <w:szCs w:val="20"/>
-        </w:rPr>
-        <w:t>Size:_</w:t>
-      </w:r>
-      <w:proofErr w:type="gramEnd"/>
-      <w:r>
-        <w:rPr>
-          <w:rFonts w:ascii="Courier New" w:hAnsi="Courier New" w:cs="Courier New"/>
-          <w:sz w:val="20"/>
-          <w:szCs w:val="20"/>
-        </w:rPr>
-        <w:t>____</w:t>
-      </w:r>
-      <w:proofErr w:type="gramStart"/>
-      <w:r>
-        <w:rPr>
-          <w:rFonts w:ascii="Courier New" w:hAnsi="Courier New" w:cs="Courier New"/>
-          <w:sz w:val="20"/>
-          <w:szCs w:val="20"/>
-        </w:rPr>
-        <w:t>_  Alignment</w:t>
-      </w:r>
-      <w:proofErr w:type="gramEnd"/>
-      <w:r>
-        <w:rPr>
-          <w:rFonts w:ascii="Courier New" w:hAnsi="Courier New" w:cs="Courier New"/>
-          <w:sz w:val="20"/>
-          <w:szCs w:val="20"/>
-        </w:rPr>
-        <w:t>: ______</w:t>
-      </w:r>
-    </w:p>
-    <w:p>
-      <w:pPr>
-        <w:ind w:left="720"/>
-        <w:rPr>
-          <w:rFonts w:ascii="Courier New" w:hAnsi="Courier New" w:cs="Courier New"/>
-          <w:sz w:val="20"/>
-          <w:szCs w:val="20"/>
-        </w:rPr>
-      </w:pPr>
-    </w:p>
-    <w:p>
-      <w:pPr>
-        <w:ind w:left="720"/>
-        <w:rPr>
-          <w:rFonts w:ascii="Courier New" w:hAnsi="Courier New" w:cs="Courier New"/>
-          <w:sz w:val="20"/>
-          <w:szCs w:val="20"/>
-        </w:rPr>
-      </w:pPr>
-      <w:r>
-        <w:rPr>
-          <w:rFonts w:ascii="Courier New" w:hAnsi="Courier New" w:cs="Courier New"/>
-          <w:sz w:val="20"/>
-          <w:szCs w:val="20"/>
-        </w:rPr>
-        <w:t xml:space="preserve">D. </w:t>
-      </w:r>
-      <w:r>
-        <w:rPr>
-          <w:rFonts w:ascii="Courier New" w:hAnsi="Courier New" w:cs="Courier New"/>
-          <w:sz w:val="20"/>
-          <w:szCs w:val="20"/>
-        </w:rPr>
-        <w:t xml:space="preserve">struct P4 </w:t>
-      </w:r>
-      <w:proofErr w:type="gramStart"/>
-      <w:r>
-        <w:rPr>
-          <w:rFonts w:ascii="Courier New" w:hAnsi="Courier New" w:cs="Courier New"/>
-          <w:sz w:val="20"/>
-          <w:szCs w:val="20"/>
-        </w:rPr>
-        <w:t>{</w:t>
+      <w:r>
+        <w:rPr>
+          <w:rFonts w:ascii="Courier New" w:hAnsi="Courier New" w:cs="Courier New"/>
+          <w:sz w:val="20"/>
+          <w:szCs w:val="20"/>
+        </w:rPr>
+        <w:t xml:space="preserve">Offsets:    </w:t>
+      </w:r>
+      <w:r>
+        <w:rPr>
+          <w:rFonts w:ascii="Courier New" w:hAnsi="Courier New" w:cs="Courier New"/>
+          <w:sz w:val="20"/>
+          <w:szCs w:val="20"/>
+          <w:highlight w:val="yellow"/>
+        </w:rPr>
+        <w:t>0</w:t>
+      </w:r>
+      <w:r>
+        <w:rPr>
+          <w:rFonts w:ascii="Courier New" w:hAnsi="Courier New" w:cs="Courier New"/>
+          <w:sz w:val="20"/>
+          <w:szCs w:val="20"/>
+        </w:rPr>
+        <w:t xml:space="preserve">   </w:t>
+      </w:r>
+      <w:r>
+        <w:rPr>
+          <w:rFonts w:ascii="Courier New" w:hAnsi="Courier New" w:cs="Courier New"/>
+          <w:sz w:val="20"/>
+          <w:szCs w:val="20"/>
+        </w:rPr>
+        <w:t xml:space="preserve">      </w:t>
+      </w:r>
+      <w:r>
+        <w:rPr>
+          <w:rFonts w:ascii="Courier New" w:hAnsi="Courier New" w:cs="Courier New"/>
+          <w:sz w:val="20"/>
+          <w:szCs w:val="20"/>
+          <w:highlight w:val="yellow"/>
+        </w:rPr>
+        <w:t>10</w:t>
+      </w:r>
+      <w:r>
+        <w:rPr>
+          <w:rFonts w:ascii="Courier New" w:hAnsi="Courier New" w:cs="Courier New"/>
+          <w:sz w:val="20"/>
+          <w:szCs w:val="20"/>
+        </w:rPr>
+        <w:t xml:space="preserve">   </w:t>
+      </w:r>
+      <w:r>
+        <w:rPr>
+          <w:rFonts w:ascii="Courier New" w:hAnsi="Courier New" w:cs="Courier New"/>
+          <w:sz w:val="20"/>
+          <w:szCs w:val="20"/>
+        </w:rPr>
+        <w:tab/>
+      </w:r>
+      <w:r>
+        <w:rPr>
+          <w:rFonts w:ascii="Courier New" w:hAnsi="Courier New" w:cs="Courier New"/>
+          <w:sz w:val="20"/>
+          <w:szCs w:val="20"/>
+        </w:rPr>
+        <w:tab/>
+      </w:r>
+      <w:r>
+        <w:rPr>
+          <w:rFonts w:ascii="Courier New" w:hAnsi="Courier New" w:cs="Courier New"/>
+          <w:sz w:val="20"/>
+          <w:szCs w:val="20"/>
+        </w:rPr>
+        <w:t xml:space="preserve">     </w:t>
+      </w:r>
+      <w:r>
+        <w:rPr>
+          <w:rFonts w:ascii="Courier New" w:hAnsi="Courier New" w:cs="Courier New"/>
+          <w:sz w:val="20"/>
+          <w:szCs w:val="20"/>
+        </w:rPr>
+        <w:t>Size</w:t>
+      </w:r>
+      <w:r>
+        <w:rPr>
+          <w:rFonts w:ascii="Courier New" w:hAnsi="Courier New" w:cs="Courier New"/>
+          <w:sz w:val="20"/>
+          <w:szCs w:val="20"/>
+        </w:rPr>
+        <w:t xml:space="preserve">: </w:t>
+      </w:r>
+      <w:r>
+        <w:rPr>
+          <w:rFonts w:ascii="Courier New" w:hAnsi="Courier New" w:cs="Courier New"/>
+          <w:sz w:val="20"/>
+          <w:szCs w:val="20"/>
+          <w:highlight w:val="yellow"/>
+        </w:rPr>
+        <w:t>4</w:t>
+      </w:r>
+      <w:r>
+        <w:rPr>
+          <w:rFonts w:ascii="Courier New" w:hAnsi="Courier New" w:cs="Courier New"/>
+          <w:sz w:val="20"/>
+          <w:szCs w:val="20"/>
+          <w:highlight w:val="yellow"/>
+        </w:rPr>
+        <w:t>0</w:t>
+      </w:r>
+      <w:r>
+        <w:rPr>
+          <w:rFonts w:ascii="Courier New" w:hAnsi="Courier New" w:cs="Courier New"/>
+          <w:sz w:val="20"/>
+          <w:szCs w:val="20"/>
+        </w:rPr>
+        <w:t xml:space="preserve">   </w:t>
+      </w:r>
+      <w:r>
+        <w:rPr>
+          <w:rFonts w:ascii="Courier New" w:hAnsi="Courier New" w:cs="Courier New"/>
+          <w:sz w:val="20"/>
+          <w:szCs w:val="20"/>
+        </w:rPr>
+        <w:t xml:space="preserve">  Alignment:</w:t>
       </w:r>
       <w:r>
         <w:rPr>
@@ -3620,18 +3146,10 @@
           <w:rFonts w:ascii="Courier New" w:hAnsi="Courier New" w:cs="Courier New"/>
           <w:sz w:val="20"/>
           <w:szCs w:val="20"/>
-        </w:rPr>
-        <w:t>shor</w:t>
-      </w:r>
-      <w:r>
-        <w:rPr>
-          <w:rFonts w:ascii="Courier New" w:hAnsi="Courier New" w:cs="Courier New"/>
-          <w:sz w:val="20"/>
-          <w:szCs w:val="20"/>
-        </w:rPr>
-        <w:t>t</w:t>
-      </w:r>
-      <w:proofErr w:type="gramEnd"/>
+          <w:highlight w:val="yellow"/>
+        </w:rPr>
+        <w:t>8</w:t>
+      </w:r>
       <w:r>
         <w:rPr>
           <w:rFonts w:ascii="Courier New" w:hAnsi="Courier New" w:cs="Courier New"/>
@@ -3640,67 +3158,57 @@
         </w:rPr>
         <w:t xml:space="preserve"> </w:t>
       </w:r>
-      <w:proofErr w:type="gramStart"/>
-      <w:r>
-        <w:rPr>
-          <w:rFonts w:ascii="Courier New" w:hAnsi="Courier New" w:cs="Courier New"/>
-          <w:sz w:val="20"/>
-          <w:szCs w:val="20"/>
-        </w:rPr>
-        <w:t>w[</w:t>
-      </w:r>
-      <w:proofErr w:type="gramEnd"/>
-      <w:r>
-        <w:rPr>
-          <w:rFonts w:ascii="Courier New" w:hAnsi="Courier New" w:cs="Courier New"/>
-          <w:sz w:val="20"/>
-          <w:szCs w:val="20"/>
-        </w:rPr>
-        <w:t>5</w:t>
-      </w:r>
-      <w:r>
-        <w:rPr>
-          <w:rFonts w:ascii="Courier New" w:hAnsi="Courier New" w:cs="Courier New"/>
-          <w:sz w:val="20"/>
-          <w:szCs w:val="20"/>
-        </w:rPr>
-        <w:t>]; char *</w:t>
-      </w:r>
-      <w:proofErr w:type="gramStart"/>
-      <w:r>
-        <w:rPr>
-          <w:rFonts w:ascii="Courier New" w:hAnsi="Courier New" w:cs="Courier New"/>
-          <w:sz w:val="20"/>
-          <w:szCs w:val="20"/>
-        </w:rPr>
-        <w:t>c[</w:t>
-      </w:r>
-      <w:proofErr w:type="gramEnd"/>
-      <w:r>
-        <w:rPr>
-          <w:rFonts w:ascii="Courier New" w:hAnsi="Courier New" w:cs="Courier New"/>
-          <w:sz w:val="20"/>
-          <w:szCs w:val="20"/>
-        </w:rPr>
-        <w:t>3</w:t>
-      </w:r>
-      <w:proofErr w:type="gramStart"/>
-      <w:r>
-        <w:rPr>
-          <w:rFonts w:ascii="Courier New" w:hAnsi="Courier New" w:cs="Courier New"/>
-          <w:sz w:val="20"/>
-          <w:szCs w:val="20"/>
-        </w:rPr>
-        <w:t>] }</w:t>
-      </w:r>
-      <w:proofErr w:type="gramEnd"/>
-      <w:r>
-        <w:rPr>
-          <w:rFonts w:ascii="Courier New" w:hAnsi="Courier New" w:cs="Courier New"/>
-          <w:sz w:val="20"/>
-          <w:szCs w:val="20"/>
-        </w:rPr>
-        <w:t>;</w:t>
+    </w:p>
+    <w:p>
+      <w:pPr>
+        <w:ind w:left="720"/>
+        <w:rPr>
+          <w:rFonts w:ascii="Courier New" w:hAnsi="Courier New" w:cs="Courier New"/>
+          <w:sz w:val="20"/>
+          <w:szCs w:val="20"/>
+        </w:rPr>
+      </w:pPr>
+    </w:p>
+    <w:p>
+      <w:pPr>
+        <w:ind w:left="720"/>
+        <w:rPr>
+          <w:rFonts w:ascii="Courier New" w:hAnsi="Courier New" w:cs="Courier New"/>
+          <w:sz w:val="20"/>
+          <w:szCs w:val="20"/>
+        </w:rPr>
+      </w:pPr>
+      <w:r>
+        <w:rPr>
+          <w:rFonts w:ascii="Courier New" w:hAnsi="Courier New" w:cs="Courier New"/>
+          <w:sz w:val="20"/>
+          <w:szCs w:val="20"/>
+        </w:rPr>
+        <w:t>E. struct P5</w:t>
+      </w:r>
+      <w:r>
+        <w:rPr>
+          <w:rFonts w:ascii="Courier New" w:hAnsi="Courier New" w:cs="Courier New"/>
+          <w:sz w:val="20"/>
+          <w:szCs w:val="20"/>
+        </w:rPr>
+        <w:t xml:space="preserve"> {</w:t>
+      </w:r>
+      <w:r>
+        <w:rPr>
+          <w:rFonts w:ascii="Courier New" w:hAnsi="Courier New" w:cs="Courier New"/>
+          <w:sz w:val="20"/>
+          <w:szCs w:val="20"/>
+        </w:rPr>
+        <w:t xml:space="preserve"> struct P3 a[2]; struct P2 t</w:t>
+      </w:r>
+      <w:r>
+        <w:rPr>
+          <w:rFonts w:ascii="Courier New" w:hAnsi="Courier New" w:cs="Courier New"/>
+          <w:sz w:val="20"/>
+          <w:szCs w:val="20"/>
+        </w:rPr>
+        <w:t xml:space="preserve"> };</w:t>
       </w:r>
     </w:p>
     <w:p>
@@ -3726,23 +3234,66 @@
           <w:sz w:val="20"/>
           <w:szCs w:val="20"/>
         </w:rPr>
-        <w:t xml:space="preserve">Offsets:    ____      ____   </w:t>
-      </w:r>
-      <w:r>
-        <w:rPr>
-          <w:rFonts w:ascii="Courier New" w:hAnsi="Courier New" w:cs="Courier New"/>
-          <w:sz w:val="20"/>
-          <w:szCs w:val="20"/>
-        </w:rPr>
-        <w:tab/>
-      </w:r>
-      <w:r>
-        <w:rPr>
-          <w:rFonts w:ascii="Courier New" w:hAnsi="Courier New" w:cs="Courier New"/>
-          <w:sz w:val="20"/>
-          <w:szCs w:val="20"/>
-        </w:rPr>
-        <w:tab/>
+        <w:t xml:space="preserve">Offsets:  </w:t>
+      </w:r>
+      <w:r>
+        <w:rPr>
+          <w:rFonts w:ascii="Courier New" w:hAnsi="Courier New" w:cs="Courier New"/>
+          <w:sz w:val="20"/>
+          <w:szCs w:val="20"/>
+        </w:rPr>
+        <w:t xml:space="preserve">  </w:t>
+      </w:r>
+      <w:r>
+        <w:rPr>
+          <w:rFonts w:ascii="Courier New" w:hAnsi="Courier New" w:cs="Courier New"/>
+          <w:sz w:val="20"/>
+          <w:szCs w:val="20"/>
+        </w:rPr>
+        <w:t xml:space="preserve">   </w:t>
+      </w:r>
+      <w:r>
+        <w:rPr>
+          <w:rFonts w:ascii="Courier New" w:hAnsi="Courier New" w:cs="Courier New"/>
+          <w:sz w:val="20"/>
+          <w:szCs w:val="20"/>
+        </w:rPr>
+        <w:t xml:space="preserve">   </w:t>
+      </w:r>
+      <w:r>
+        <w:rPr>
+          <w:rFonts w:ascii="Courier New" w:hAnsi="Courier New" w:cs="Courier New"/>
+          <w:sz w:val="20"/>
+          <w:szCs w:val="20"/>
+          <w:highlight w:val="yellow"/>
+        </w:rPr>
+        <w:t>0</w:t>
+      </w:r>
+      <w:r>
+        <w:rPr>
+          <w:rFonts w:ascii="Courier New" w:hAnsi="Courier New" w:cs="Courier New"/>
+          <w:sz w:val="20"/>
+          <w:szCs w:val="20"/>
+        </w:rPr>
+        <w:t xml:space="preserve">           </w:t>
+      </w:r>
+      <w:r>
+        <w:rPr>
+          <w:rFonts w:ascii="Courier New" w:hAnsi="Courier New" w:cs="Courier New"/>
+          <w:sz w:val="20"/>
+          <w:szCs w:val="20"/>
+          <w:highlight w:val="yellow"/>
+        </w:rPr>
+        <w:t>2</w:t>
+      </w:r>
+      <w:r>
+        <w:rPr>
+          <w:rFonts w:ascii="Courier New" w:hAnsi="Courier New" w:cs="Courier New"/>
+          <w:sz w:val="20"/>
+          <w:szCs w:val="20"/>
+          <w:highlight w:val="yellow"/>
+        </w:rPr>
+        <w:t>4</w:t>
       </w:r>
       <w:r>
         <w:rPr>
@@ -3752,69 +3303,21 @@
         </w:rPr>
         <w:t xml:space="preserve">     </w:t>
       </w:r>
-      <w:proofErr w:type="gramStart"/>
-      <w:r>
-        <w:rPr>
-          <w:rFonts w:ascii="Courier New" w:hAnsi="Courier New" w:cs="Courier New"/>
-          <w:sz w:val="20"/>
-          <w:szCs w:val="20"/>
-        </w:rPr>
-        <w:t>Size:_</w:t>
-      </w:r>
-      <w:proofErr w:type="gramEnd"/>
-      <w:r>
-        <w:rPr>
-          <w:rFonts w:ascii="Courier New" w:hAnsi="Courier New" w:cs="Courier New"/>
-          <w:sz w:val="20"/>
-          <w:szCs w:val="20"/>
-        </w:rPr>
-        <w:t>____</w:t>
-      </w:r>
-      <w:proofErr w:type="gramStart"/>
-      <w:r>
-        <w:rPr>
-          <w:rFonts w:ascii="Courier New" w:hAnsi="Courier New" w:cs="Courier New"/>
-          <w:sz w:val="20"/>
-          <w:szCs w:val="20"/>
-        </w:rPr>
-        <w:t>_  Alignment</w:t>
-      </w:r>
-      <w:proofErr w:type="gramEnd"/>
-      <w:r>
-        <w:rPr>
-          <w:rFonts w:ascii="Courier New" w:hAnsi="Courier New" w:cs="Courier New"/>
-          <w:sz w:val="20"/>
-          <w:szCs w:val="20"/>
-        </w:rPr>
-        <w:t>: ______</w:t>
-      </w:r>
-    </w:p>
-    <w:p>
-      <w:pPr>
-        <w:ind w:left="720"/>
-        <w:rPr>
-          <w:rFonts w:ascii="Courier New" w:hAnsi="Courier New" w:cs="Courier New"/>
-          <w:sz w:val="20"/>
-          <w:szCs w:val="20"/>
-        </w:rPr>
-      </w:pPr>
-    </w:p>
-    <w:p>
-      <w:pPr>
-        <w:ind w:left="720"/>
-        <w:rPr>
-          <w:rFonts w:ascii="Courier New" w:hAnsi="Courier New" w:cs="Courier New"/>
-          <w:sz w:val="20"/>
-          <w:szCs w:val="20"/>
-        </w:rPr>
-      </w:pPr>
-      <w:r>
-        <w:rPr>
-          <w:rFonts w:ascii="Courier New" w:hAnsi="Courier New" w:cs="Courier New"/>
-          <w:sz w:val="20"/>
-          <w:szCs w:val="20"/>
-        </w:rPr>
-        <w:t>E. struct P5</w:t>
+      <w:r>
+        <w:rPr>
+          <w:rFonts w:ascii="Courier New" w:hAnsi="Courier New" w:cs="Courier New"/>
+          <w:sz w:val="20"/>
+          <w:szCs w:val="20"/>
+        </w:rPr>
+        <w:t xml:space="preserve">     </w:t>
+      </w:r>
+      <w:r>
+        <w:rPr>
+          <w:rFonts w:ascii="Courier New" w:hAnsi="Courier New" w:cs="Courier New"/>
+          <w:sz w:val="20"/>
+          <w:szCs w:val="20"/>
+        </w:rPr>
+        <w:t>Size:</w:t>
       </w:r>
       <w:r>
         <w:rPr>
@@ -3824,101 +3327,14 @@
         </w:rPr>
         <w:t xml:space="preserve"> </w:t>
       </w:r>
-      <w:proofErr w:type="gramStart"/>
-      <w:r>
-        <w:rPr>
-          <w:rFonts w:ascii="Courier New" w:hAnsi="Courier New" w:cs="Courier New"/>
-          <w:sz w:val="20"/>
-          <w:szCs w:val="20"/>
-        </w:rPr>
-        <w:t>{</w:t>
-      </w:r>
-      <w:r>
-        <w:rPr>
-          <w:rFonts w:ascii="Courier New" w:hAnsi="Courier New" w:cs="Courier New"/>
-          <w:sz w:val="20"/>
-          <w:szCs w:val="20"/>
-        </w:rPr>
-        <w:t xml:space="preserve"> struct</w:t>
-      </w:r>
-      <w:proofErr w:type="gramEnd"/>
-      <w:r>
-        <w:rPr>
-          <w:rFonts w:ascii="Courier New" w:hAnsi="Courier New" w:cs="Courier New"/>
-          <w:sz w:val="20"/>
-          <w:szCs w:val="20"/>
-        </w:rPr>
-        <w:t xml:space="preserve"> P3 </w:t>
-      </w:r>
-      <w:proofErr w:type="gramStart"/>
-      <w:r>
-        <w:rPr>
-          <w:rFonts w:ascii="Courier New" w:hAnsi="Courier New" w:cs="Courier New"/>
-          <w:sz w:val="20"/>
-          <w:szCs w:val="20"/>
-        </w:rPr>
-        <w:t>a[</w:t>
-      </w:r>
-      <w:proofErr w:type="gramEnd"/>
-      <w:r>
-        <w:rPr>
-          <w:rFonts w:ascii="Courier New" w:hAnsi="Courier New" w:cs="Courier New"/>
-          <w:sz w:val="20"/>
-          <w:szCs w:val="20"/>
-        </w:rPr>
-        <w:t xml:space="preserve">2]; struct P2 </w:t>
-      </w:r>
-      <w:proofErr w:type="gramStart"/>
-      <w:r>
-        <w:rPr>
-          <w:rFonts w:ascii="Courier New" w:hAnsi="Courier New" w:cs="Courier New"/>
-          <w:sz w:val="20"/>
-          <w:szCs w:val="20"/>
-        </w:rPr>
-        <w:t>t</w:t>
-      </w:r>
-      <w:r>
-        <w:rPr>
-          <w:rFonts w:ascii="Courier New" w:hAnsi="Courier New" w:cs="Courier New"/>
-          <w:sz w:val="20"/>
-          <w:szCs w:val="20"/>
-        </w:rPr>
-        <w:t xml:space="preserve"> }</w:t>
-      </w:r>
-      <w:proofErr w:type="gramEnd"/>
-      <w:r>
-        <w:rPr>
-          <w:rFonts w:ascii="Courier New" w:hAnsi="Courier New" w:cs="Courier New"/>
-          <w:sz w:val="20"/>
-          <w:szCs w:val="20"/>
-        </w:rPr>
-        <w:t>;</w:t>
-      </w:r>
-    </w:p>
-    <w:p>
-      <w:pPr>
-        <w:ind w:left="720"/>
-        <w:rPr>
-          <w:rFonts w:ascii="Courier New" w:hAnsi="Courier New" w:cs="Courier New"/>
-          <w:sz w:val="20"/>
-          <w:szCs w:val="20"/>
-        </w:rPr>
-      </w:pPr>
-      <w:r>
-        <w:rPr>
-          <w:rFonts w:ascii="Courier New" w:hAnsi="Courier New" w:cs="Courier New"/>
-          <w:sz w:val="20"/>
-          <w:szCs w:val="20"/>
-        </w:rPr>
-        <w:t xml:space="preserve">     </w:t>
-      </w:r>
-      <w:r>
-        <w:rPr>
-          <w:rFonts w:ascii="Courier New" w:hAnsi="Courier New" w:cs="Courier New"/>
-          <w:sz w:val="20"/>
-          <w:szCs w:val="20"/>
-        </w:rPr>
-        <w:t xml:space="preserve">Offsets:  </w:t>
+      <w:r>
+        <w:rPr>
+          <w:rFonts w:ascii="Courier New" w:hAnsi="Courier New" w:cs="Courier New"/>
+          <w:sz w:val="20"/>
+          <w:szCs w:val="20"/>
+          <w:highlight w:val="yellow"/>
+        </w:rPr>
+        <w:t>40</w:t>
       </w:r>
       <w:r>
         <w:rPr>
@@ -3942,48 +3358,20 @@
           <w:sz w:val="20"/>
           <w:szCs w:val="20"/>
         </w:rPr>
-        <w:t xml:space="preserve">   ____           ____     </w:t>
-      </w:r>
-      <w:proofErr w:type="gramStart"/>
-      <w:r>
-        <w:rPr>
-          <w:rFonts w:ascii="Courier New" w:hAnsi="Courier New" w:cs="Courier New"/>
-          <w:sz w:val="20"/>
-          <w:szCs w:val="20"/>
-        </w:rPr>
-        <w:t>Size:_</w:t>
-      </w:r>
-      <w:proofErr w:type="gramEnd"/>
-      <w:r>
-        <w:rPr>
-          <w:rFonts w:ascii="Courier New" w:hAnsi="Courier New" w:cs="Courier New"/>
-          <w:sz w:val="20"/>
-          <w:szCs w:val="20"/>
-        </w:rPr>
-        <w:t>____</w:t>
-      </w:r>
-      <w:proofErr w:type="gramStart"/>
-      <w:r>
-        <w:rPr>
-          <w:rFonts w:ascii="Courier New" w:hAnsi="Courier New" w:cs="Courier New"/>
-          <w:sz w:val="20"/>
-          <w:szCs w:val="20"/>
-        </w:rPr>
-        <w:t>_  Alignment</w:t>
-      </w:r>
-      <w:proofErr w:type="gramEnd"/>
-      <w:r>
-        <w:rPr>
-          <w:rFonts w:ascii="Courier New" w:hAnsi="Courier New" w:cs="Courier New"/>
-          <w:sz w:val="20"/>
-          <w:szCs w:val="20"/>
-        </w:rPr>
-        <w:t>: ______</w:t>
-      </w:r>
-    </w:p>
-    <w:p>
-      <w:pPr>
-        <w:ind w:left="720"/>
+        <w:t xml:space="preserve">Alignment: </w:t>
+      </w:r>
+      <w:r>
+        <w:rPr>
+          <w:rFonts w:ascii="Courier New" w:hAnsi="Courier New" w:cs="Courier New"/>
+          <w:sz w:val="20"/>
+          <w:szCs w:val="20"/>
+          <w:highlight w:val="yellow"/>
+        </w:rPr>
+        <w:t>8</w:t>
+      </w:r>
+    </w:p>
+    <w:p>
+      <w:pPr>
         <w:rPr>
           <w:rFonts w:ascii="Courier New" w:hAnsi="Courier New" w:cs="Courier New"/>
           <w:sz w:val="20"/>
@@ -4636,29 +4024,7 @@
                 <w:sz w:val="22"/>
                 <w:szCs w:val="22"/>
               </w:rPr>
-              <w:t xml:space="preserve">In memory, multi-dimensional arrays are </w:t>
-            </w:r>
-            <w:proofErr w:type="gramStart"/>
-            <w:r>
-              <w:rPr>
-                <w:rFonts w:ascii="Calibri" w:hAnsi="Calibri"/>
-                <w:strike/>
-                <w:color w:val="000000"/>
-                <w:sz w:val="22"/>
-                <w:szCs w:val="22"/>
-              </w:rPr>
-              <w:t>stored</w:t>
-            </w:r>
-            <w:proofErr w:type="gramEnd"/>
-            <w:r>
-              <w:rPr>
-                <w:rFonts w:ascii="Calibri" w:hAnsi="Calibri"/>
-                <w:strike/>
-                <w:color w:val="000000"/>
-                <w:sz w:val="22"/>
-                <w:szCs w:val="22"/>
-              </w:rPr>
-              <w:t xml:space="preserve"> a row at a time as opposed to a column at a time. (The rightmost index changes most rapidly)</w:t>
+              <w:t>In memory, multi-dimensional arrays are stored a row at a time as opposed to a column at a time. (The rightmost index changes most rapidly)</w:t>
             </w:r>
           </w:p>
           <w:p>
@@ -4728,29 +4094,7 @@
                 <w:sz w:val="22"/>
                 <w:szCs w:val="22"/>
               </w:rPr>
-              <w:t xml:space="preserve">The portion of the stack </w:t>
-            </w:r>
-            <w:proofErr w:type="gramStart"/>
-            <w:r>
-              <w:rPr>
-                <w:rFonts w:ascii="Calibri" w:hAnsi="Calibri"/>
-                <w:strike/>
-                <w:color w:val="000000"/>
-                <w:sz w:val="22"/>
-                <w:szCs w:val="22"/>
-              </w:rPr>
-              <w:t>allocated</w:t>
-            </w:r>
-            <w:proofErr w:type="gramEnd"/>
-            <w:r>
-              <w:rPr>
-                <w:rFonts w:ascii="Calibri" w:hAnsi="Calibri"/>
-                <w:strike/>
-                <w:color w:val="000000"/>
-                <w:sz w:val="22"/>
-                <w:szCs w:val="22"/>
-              </w:rPr>
-              <w:t xml:space="preserve"> for a single procedure.</w:t>
+              <w:t>The portion of the stack allocated for a single procedure.</w:t>
             </w:r>
           </w:p>
           <w:p>
@@ -4819,29 +4163,7 @@
                 <w:sz w:val="22"/>
                 <w:szCs w:val="22"/>
               </w:rPr>
-              <w:t xml:space="preserve">When a function is called these registers can be overwritten without destroying data required by the function that </w:t>
-            </w:r>
-            <w:proofErr w:type="gramStart"/>
-            <w:r>
-              <w:rPr>
-                <w:rFonts w:ascii="Calibri" w:hAnsi="Calibri"/>
-                <w:strike/>
-                <w:color w:val="000000"/>
-                <w:sz w:val="22"/>
-                <w:szCs w:val="22"/>
-              </w:rPr>
-              <w:t>is</w:t>
-            </w:r>
-            <w:proofErr w:type="gramEnd"/>
-            <w:r>
-              <w:rPr>
-                <w:rFonts w:ascii="Calibri" w:hAnsi="Calibri"/>
-                <w:strike/>
-                <w:color w:val="000000"/>
-                <w:sz w:val="22"/>
-                <w:szCs w:val="22"/>
-              </w:rPr>
-              <w:t xml:space="preserve"> was called from</w:t>
+              <w:t>When a function is called these registers can be overwritten without destroying data required by the function that is was called from</w:t>
             </w:r>
             <w:r>
               <w:rPr>
@@ -4885,29 +4207,7 @@
                 <w:sz w:val="22"/>
                 <w:szCs w:val="22"/>
               </w:rPr>
-              <w:t xml:space="preserve">When a function is called these registers must be saved onto the stack before they may be </w:t>
-            </w:r>
-            <w:proofErr w:type="gramStart"/>
-            <w:r>
-              <w:rPr>
-                <w:rFonts w:ascii="Calibri" w:hAnsi="Calibri"/>
-                <w:strike/>
-                <w:color w:val="000000"/>
-                <w:sz w:val="22"/>
-                <w:szCs w:val="22"/>
-              </w:rPr>
-              <w:t>overwritten, and</w:t>
-            </w:r>
-            <w:proofErr w:type="gramEnd"/>
-            <w:r>
-              <w:rPr>
-                <w:rFonts w:ascii="Calibri" w:hAnsi="Calibri"/>
-                <w:strike/>
-                <w:color w:val="000000"/>
-                <w:sz w:val="22"/>
-                <w:szCs w:val="22"/>
-              </w:rPr>
-              <w:t xml:space="preserve"> must be restored before the function returns.</w:t>
+              <w:t>When a function is called these registers must be saved onto the stack before they may be overwritten, and must be restored before the function returns.</w:t>
             </w:r>
           </w:p>
         </w:tc>

</xml_diff>